<commit_message>
Atualiza README e documentacao tecnica para refletir o backend real
Os READMEs e o DOCUMENTACAO.docx ainda descreviam o estado anterior do
projeto: autenticacao mockada, dados em arrays fixos no frontend e banco
de dados como rascunho nunca implementado. Atualiza os tres READMEs e
regenera a documentacao tecnica completa para descrever a arquitetura
atual (config.py/security.py/database.py/routers, banco Postgres real no
Supabase com RLS, login com bcrypt+JWT, identidade via token de sessao) e
a tabela "o que e real x mockado" com o estado atual modulo a modulo.

Co-Authored-By: Claude Sonnet 5 <noreply@anthropic.com>
</commit_message>
<xml_diff>
--- a/docs/DOCUMENTACAO.docx
+++ b/docs/DOCUMENTACAO.docx
@@ -7,20 +7,11 @@
         <w:pStyle w:val="Title"/>
       </w:pPr>
       <w:r>
-        <w:rPr>
-          <w:color w:val="192742"/>
-          <w:sz w:val="44"/>
-        </w:rPr>
         <w:t>Intranet Eraldo Júnior Advocacia</w:t>
       </w:r>
     </w:p>
     <w:p>
       <w:r>
-        <w:rPr>
-          <w:b w:val="0"/>
-          <w:i w:val="0"/>
-          <w:color w:val="6C727C"/>
-        </w:rPr>
         <w:t>Documentação Técnica do Projeto</w:t>
       </w:r>
     </w:p>
@@ -30,19 +21,12 @@
         <w:pStyle w:val="Heading1"/>
       </w:pPr>
       <w:r>
-        <w:rPr>
-          <w:color w:val="192742"/>
-        </w:rPr>
         <w:t>Intranet Eraldo Júnior Advocacia — Documentação</w:t>
       </w:r>
     </w:p>
     <w:p>
       <w:r>
-        <w:rPr>
-          <w:b w:val="0"/>
-          <w:i w:val="0"/>
-        </w:rPr>
-        <w:t>Documentação completa do projeto: o site institucional, a intranet corporativa (frontend React) e o backend do "Meu Authenticator" e do "Assistente IA" (Python).</w:t>
+        <w:t>Documentação completa do projeto: o site institucional, a intranet corporativa (frontend React), o backend (API Python + banco PostgreSQL real) e a autenticação de usuários.</w:t>
       </w:r>
     </w:p>
     <w:p>
@@ -50,73 +34,117 @@
         <w:pStyle w:val="Heading2"/>
       </w:pPr>
       <w:r>
-        <w:rPr>
-          <w:color w:val="192742"/>
-        </w:rPr>
         <w:t>Índice</w:t>
       </w:r>
     </w:p>
     <w:p>
+      <w:pPr>
+        <w:pStyle w:val="ListBullet"/>
+      </w:pPr>
       <w:r>
         <w:t>Visão geral</w:t>
       </w:r>
     </w:p>
     <w:p>
+      <w:pPr>
+        <w:pStyle w:val="ListBullet"/>
+      </w:pPr>
       <w:r>
         <w:t>Estrutura do repositório</w:t>
       </w:r>
     </w:p>
     <w:p>
+      <w:pPr>
+        <w:pStyle w:val="ListBullet"/>
+      </w:pPr>
       <w:r>
         <w:t>Site institucional</w:t>
       </w:r>
     </w:p>
     <w:p>
+      <w:pPr>
+        <w:pStyle w:val="ListBullet"/>
+      </w:pPr>
       <w:r>
         <w:t>Intranet — aplicação React</w:t>
       </w:r>
     </w:p>
     <w:p>
+      <w:pPr>
+        <w:pStyle w:val="ListBullet"/>
+      </w:pPr>
       <w:r>
         <w:t>Navegação e performance</w:t>
       </w:r>
     </w:p>
     <w:p>
+      <w:pPr>
+        <w:pStyle w:val="ListBullet"/>
+      </w:pPr>
       <w:r>
         <w:t>Responsividade mobile</w:t>
       </w:r>
     </w:p>
     <w:p>
+      <w:pPr>
+        <w:pStyle w:val="ListBullet"/>
+      </w:pPr>
       <w:r>
-        <w:t>Backend Python — Meu Authenticator e Assistente IA</w:t>
+        <w:t>Backend Python — arquitetura</w:t>
       </w:r>
     </w:p>
     <w:p>
+      <w:pPr>
+        <w:pStyle w:val="ListBullet"/>
+      </w:pPr>
       <w:r>
-        <w:t>Banco de dados — rascunho de schema</w:t>
+        <w:t>Autenticação e sessão</w:t>
       </w:r>
     </w:p>
     <w:p>
+      <w:pPr>
+        <w:pStyle w:val="ListBullet"/>
+      </w:pPr>
+      <w:r>
+        <w:t>Banco de dados</w:t>
+      </w:r>
+    </w:p>
+    <w:p>
+      <w:pPr>
+        <w:pStyle w:val="ListBullet"/>
+      </w:pPr>
       <w:r>
         <w:t>Publicação / build</w:t>
       </w:r>
     </w:p>
     <w:p>
+      <w:pPr>
+        <w:pStyle w:val="ListBullet"/>
+      </w:pPr>
       <w:r>
         <w:t>O que é real e o que é mockado</w:t>
       </w:r>
     </w:p>
     <w:p>
+      <w:pPr>
+        <w:pStyle w:val="ListBullet"/>
+      </w:pPr>
       <w:r>
         <w:t>Design system</w:t>
       </w:r>
     </w:p>
     <w:p>
+      <w:pPr>
+        <w:pStyle w:val="ListBullet"/>
+      </w:pPr>
       <w:r>
         <w:t>Segurança</w:t>
       </w:r>
     </w:p>
     <w:p>
+      <w:pPr>
+        <w:pStyle w:val="ListBullet"/>
+      </w:pPr>
       <w:r>
         <w:t>Próximos passos sugeridos</w:t>
       </w:r>
@@ -126,18 +154,11 @@
         <w:pStyle w:val="Heading2"/>
       </w:pPr>
       <w:r>
-        <w:rPr>
-          <w:color w:val="192742"/>
-        </w:rPr>
         <w:t>Visão geral</w:t>
       </w:r>
     </w:p>
     <w:p>
       <w:r>
-        <w:rPr>
-          <w:b w:val="0"/>
-          <w:i w:val="0"/>
-        </w:rPr>
         <w:t>O projeto tem quatro partes independentes:</w:t>
       </w:r>
     </w:p>
@@ -162,7 +183,7 @@
         <w:pStyle w:val="ListBullet"/>
       </w:pPr>
       <w:r>
-        <w:t>backend/ — API Python (Meu Authenticator + Assistente IA) e o rascunho de banco de dados</w:t>
+        <w:t>backend/ — API Python (FastAPI) com banco PostgreSQL real (Supabase): autenticação, todos os módulos de dados, Meu Authenticator e Assistente IA</w:t>
       </w:r>
     </w:p>
     <w:p>
@@ -175,10 +196,6 @@
     </w:p>
     <w:p>
       <w:r>
-        <w:rPr>
-          <w:b w:val="0"/>
-          <w:i w:val="0"/>
-        </w:rPr>
         <w:t>O site institucional tem um item de menu "Intranet Escritório" que aponta para intranet/ (o build publicado da intranet, dentro de site/) — ou seja: alguém navegando pelo site público consegue chegar até a tela de login da intranet.</w:t>
       </w:r>
     </w:p>
@@ -187,336 +204,131 @@
         <w:pStyle w:val="Heading2"/>
       </w:pPr>
       <w:r>
-        <w:rPr>
-          <w:color w:val="192742"/>
-        </w:rPr>
         <w:t>Estrutura do repositório</w:t>
       </w:r>
     </w:p>
     <w:p>
-      <w:pPr>
-        <w:ind w:left="283"/>
-      </w:pPr>
       <w:r>
-        <w:rPr>
-          <w:rFonts w:ascii="Consolas" w:hAnsi="Consolas"/>
-          <w:sz w:val="19"/>
-        </w:rPr>
         <w:t>.</w:t>
+      </w:r>
+      <w:r>
         <w:br/>
+      </w:r>
+      <w:r>
         <w:t>├── site/                        → site institucional (estático) + build publicado da intranet</w:t>
+      </w:r>
+      <w:r>
         <w:br/>
+      </w:r>
+      <w:r>
         <w:t>│   ├── index.html, assets/      → réplica do site público</w:t>
+      </w:r>
+      <w:r>
         <w:br/>
+      </w:r>
+      <w:r>
         <w:t>│   └── intranet/                → build de intranet-app/ publicado aqui (gitignored)</w:t>
+      </w:r>
+      <w:r>
         <w:br/>
+      </w:r>
+      <w:r>
         <w:t>├── docs/                        → documentação do projeto (este arquivo, proposta visual, levantamento de conteúdo)</w:t>
+      </w:r>
+      <w:r>
         <w:br/>
+      </w:r>
+      <w:r>
         <w:t>├── intranet-app/                → código-fonte da intranet (React)</w:t>
+      </w:r>
+      <w:r>
         <w:br/>
-        <w:t>└── backend/                     → API Python (Authenticator + Assistente IA)</w:t>
+      </w:r>
+      <w:r>
+        <w:t>└── backend/                     → API Python (FastAPI) + banco PostgreSQL (Supabase)</w:t>
+      </w:r>
+      <w:r>
         <w:br/>
-        <w:t xml:space="preserve">    ├── main.py                  → app FastAPI, monta os dois routers</w:t>
+      </w:r>
+      <w:r>
+        <w:t xml:space="preserve">    ├── main.py                  → app FastAPI: monta todos os routers, CORS, pool de conexão</w:t>
+      </w:r>
+      <w:r>
         <w:br/>
-        <w:t xml:space="preserve">    ├── security.py              → checagem de X-API-Key compartilhada</w:t>
+      </w:r>
+      <w:r>
+        <w:t xml:space="preserve">    ├── config.py                → variáveis de ambiente centralizadas</w:t>
+      </w:r>
+      <w:r>
         <w:br/>
+      </w:r>
+      <w:r>
+        <w:t xml:space="preserve">    ├── security.py              → X-API-Key, hash de senha (bcrypt), sessão (JWT)</w:t>
+      </w:r>
+      <w:r>
+        <w:br/>
+      </w:r>
+      <w:r>
+        <w:t xml:space="preserve">    ├── database.py              → pool de conexões e helpers de query</w:t>
+      </w:r>
+      <w:r>
+        <w:br/>
+      </w:r>
+      <w:r>
+        <w:t xml:space="preserve">    ├── routers/                 → um módulo por área (auth, funcionarios, agenda, avisos, solicitacoes...)</w:t>
+      </w:r>
+      <w:r>
+        <w:br/>
+      </w:r>
+      <w:r>
         <w:t xml:space="preserve">    ├── assistant/                → router + busca semântica (RAG) do Assistente IA</w:t>
+      </w:r>
+      <w:r>
         <w:br/>
+      </w:r>
+      <w:r>
         <w:t xml:space="preserve">    ├── knowledge_base/           → documentação indexada (.md, .docx, .pdf)</w:t>
+      </w:r>
+      <w:r>
         <w:br/>
-        <w:t xml:space="preserve">    └── db/schema.sql             → rascunho de schema PostgreSQL (Supabase), ainda não implementado</w:t>
+      </w:r>
+      <w:r>
+        <w:t xml:space="preserve">    └── db/</w:t>
+      </w:r>
+      <w:r>
+        <w:br/>
+      </w:r>
+      <w:r>
+        <w:t xml:space="preserve">        ├── schema.sql            → schema PostgreSQL completo, já aplicado no Supabase (18 tabelas + RLS)</w:t>
+      </w:r>
+      <w:r>
+        <w:br/>
+      </w:r>
+      <w:r>
+        <w:t xml:space="preserve">        ├── seed_*.py             → dados de demonstração, um script por tabela</w:t>
+      </w:r>
+      <w:r>
+        <w:br/>
+      </w:r>
+      <w:r>
+        <w:t xml:space="preserve">        └── set_senha.py          → CLI para definir/resetar senha de um usuário</w:t>
       </w:r>
     </w:p>
     <w:p>
       <w:r>
-        <w:rPr>
-          <w:b w:val="0"/>
-          <w:i w:val="0"/>
-        </w:rPr>
         <w:t>Não existe build compilado do frontend versionado no git (site/intranet/) — gerar e publicar esse build é sempre um passo separado, feito sob demanda (ver "Publicação / build" abaixo). Isso mantém o repositório só com código-fonte, sem os arquivos gerados a cada build poluindo o histórico de commits.</w:t>
       </w:r>
     </w:p>
-    <w:tbl>
-      <w:tblPr>
-        <w:tblStyle w:val="LightGrid-Accent1"/>
-        <w:tblW w:type="auto" w:w="0"/>
-        <w:jc w:val="center"/>
-        <w:tblLook w:firstColumn="1" w:firstRow="1" w:lastColumn="0" w:lastRow="0" w:noHBand="0" w:noVBand="1" w:val="04A0"/>
-      </w:tblPr>
-      <w:tblGrid>
-        <w:gridCol w:w="3324"/>
-        <w:gridCol w:w="3324"/>
-        <w:gridCol w:w="3324"/>
-      </w:tblGrid>
-      <w:tr>
-        <w:tc>
-          <w:tcPr>
-            <w:tcW w:type="dxa" w:w="2551"/>
-            <w:shd w:fill="192742"/>
-          </w:tcPr>
-          <w:p>
-            <w:r/>
-            <w:r>
-              <w:rPr>
-                <w:b/>
-                <w:color w:val="FFFFFF"/>
-              </w:rPr>
-              <w:t>Parte</w:t>
-            </w:r>
-          </w:p>
-        </w:tc>
-        <w:tc>
-          <w:tcPr>
-            <w:tcW w:type="dxa" w:w="2835"/>
-            <w:shd w:fill="192742"/>
-          </w:tcPr>
-          <w:p>
-            <w:r/>
-            <w:r>
-              <w:rPr>
-                <w:b/>
-                <w:color w:val="FFFFFF"/>
-              </w:rPr>
-              <w:t>Pasta</w:t>
-            </w:r>
-          </w:p>
-        </w:tc>
-        <w:tc>
-          <w:tcPr>
-            <w:tcW w:type="dxa" w:w="3969"/>
-            <w:shd w:fill="192742"/>
-          </w:tcPr>
-          <w:p>
-            <w:r/>
-            <w:r>
-              <w:rPr>
-                <w:b/>
-                <w:color w:val="FFFFFF"/>
-              </w:rPr>
-              <w:t>O que é</w:t>
-            </w:r>
-          </w:p>
-        </w:tc>
-      </w:tr>
-      <w:tr>
-        <w:tc>
-          <w:tcPr>
-            <w:tcW w:type="dxa" w:w="2551"/>
-          </w:tcPr>
-          <w:p>
-            <w:pPr>
-              <w:spacing w:after="40"/>
-            </w:pPr>
-            <w:r>
-              <w:rPr>
-                <w:sz w:val="19"/>
-              </w:rPr>
-              <w:t>Site institucional</w:t>
-            </w:r>
-          </w:p>
-        </w:tc>
-        <w:tc>
-          <w:tcPr>
-            <w:tcW w:type="dxa" w:w="2835"/>
-          </w:tcPr>
-          <w:p>
-            <w:pPr>
-              <w:spacing w:after="40"/>
-            </w:pPr>
-            <w:r>
-              <w:rPr>
-                <w:sz w:val="19"/>
-              </w:rPr>
-              <w:t>site/ (index.html + assets/)</w:t>
-            </w:r>
-          </w:p>
-        </w:tc>
-        <w:tc>
-          <w:tcPr>
-            <w:tcW w:type="dxa" w:w="3969"/>
-          </w:tcPr>
-          <w:p>
-            <w:pPr>
-              <w:spacing w:after="40"/>
-            </w:pPr>
-            <w:r>
-              <w:rPr>
-                <w:sz w:val="19"/>
-              </w:rPr>
-              <w:t>Réplica estática do site público do escritório.</w:t>
-            </w:r>
-          </w:p>
-        </w:tc>
-      </w:tr>
-      <w:tr>
-        <w:tc>
-          <w:tcPr>
-            <w:tcW w:type="dxa" w:w="2551"/>
-          </w:tcPr>
-          <w:p>
-            <w:pPr>
-              <w:spacing w:after="40"/>
-            </w:pPr>
-            <w:r>
-              <w:rPr>
-                <w:sz w:val="19"/>
-              </w:rPr>
-              <w:t>Intranet (código-fonte)</w:t>
-            </w:r>
-          </w:p>
-        </w:tc>
-        <w:tc>
-          <w:tcPr>
-            <w:tcW w:type="dxa" w:w="2835"/>
-          </w:tcPr>
-          <w:p>
-            <w:pPr>
-              <w:spacing w:after="40"/>
-            </w:pPr>
-            <w:r>
-              <w:rPr>
-                <w:sz w:val="19"/>
-              </w:rPr>
-              <w:t>intranet-app/</w:t>
-            </w:r>
-          </w:p>
-        </w:tc>
-        <w:tc>
-          <w:tcPr>
-            <w:tcW w:type="dxa" w:w="3969"/>
-          </w:tcPr>
-          <w:p>
-            <w:pPr>
-              <w:spacing w:after="40"/>
-            </w:pPr>
-            <w:r>
-              <w:rPr>
-                <w:sz w:val="19"/>
-              </w:rPr>
-              <w:t>Aplicação React + TypeScript — único lugar onde o código da intranet é editado.</w:t>
-            </w:r>
-          </w:p>
-        </w:tc>
-      </w:tr>
-      <w:tr>
-        <w:tc>
-          <w:tcPr>
-            <w:tcW w:type="dxa" w:w="2551"/>
-          </w:tcPr>
-          <w:p>
-            <w:pPr>
-              <w:spacing w:after="40"/>
-            </w:pPr>
-            <w:r>
-              <w:rPr>
-                <w:sz w:val="19"/>
-              </w:rPr>
-              <w:t>Backend (Authenticator + Assistente IA)</w:t>
-            </w:r>
-          </w:p>
-        </w:tc>
-        <w:tc>
-          <w:tcPr>
-            <w:tcW w:type="dxa" w:w="2835"/>
-          </w:tcPr>
-          <w:p>
-            <w:pPr>
-              <w:spacing w:after="40"/>
-            </w:pPr>
-            <w:r>
-              <w:rPr>
-                <w:sz w:val="19"/>
-              </w:rPr>
-              <w:t>backend/</w:t>
-            </w:r>
-          </w:p>
-        </w:tc>
-        <w:tc>
-          <w:tcPr>
-            <w:tcW w:type="dxa" w:w="3969"/>
-          </w:tcPr>
-          <w:p>
-            <w:pPr>
-              <w:spacing w:after="40"/>
-            </w:pPr>
-            <w:r>
-              <w:rPr>
-                <w:sz w:val="19"/>
-              </w:rPr>
-              <w:t>API Python (FastAPI) com dois serviços: códigos TOTP e busca na documentação interna.</w:t>
-            </w:r>
-          </w:p>
-        </w:tc>
-      </w:tr>
-      <w:tr>
-        <w:tc>
-          <w:tcPr>
-            <w:tcW w:type="dxa" w:w="2551"/>
-          </w:tcPr>
-          <w:p>
-            <w:pPr>
-              <w:spacing w:after="40"/>
-            </w:pPr>
-            <w:r>
-              <w:rPr>
-                <w:sz w:val="19"/>
-              </w:rPr>
-              <w:t>Documentação do projeto</w:t>
-            </w:r>
-          </w:p>
-        </w:tc>
-        <w:tc>
-          <w:tcPr>
-            <w:tcW w:type="dxa" w:w="2835"/>
-          </w:tcPr>
-          <w:p>
-            <w:pPr>
-              <w:spacing w:after="40"/>
-            </w:pPr>
-            <w:r>
-              <w:rPr>
-                <w:sz w:val="19"/>
-              </w:rPr>
-              <w:t>docs/</w:t>
-            </w:r>
-          </w:p>
-        </w:tc>
-        <w:tc>
-          <w:tcPr>
-            <w:tcW w:type="dxa" w:w="3969"/>
-          </w:tcPr>
-          <w:p>
-            <w:pPr>
-              <w:spacing w:after="40"/>
-            </w:pPr>
-            <w:r>
-              <w:rPr>
-                <w:sz w:val="19"/>
-              </w:rPr>
-              <w:t>Esta documentação técnica, a proposta visual (.pptx) e o levantamento de conteúdo necessário do escritório.</w:t>
-            </w:r>
-          </w:p>
-        </w:tc>
-      </w:tr>
-    </w:tbl>
-    <w:p/>
     <w:p>
       <w:pPr>
         <w:pStyle w:val="Heading2"/>
       </w:pPr>
       <w:r>
-        <w:rPr>
-          <w:color w:val="192742"/>
-        </w:rPr>
         <w:t>Site institucional</w:t>
       </w:r>
     </w:p>
     <w:p>
       <w:r>
-        <w:rPr>
-          <w:b w:val="0"/>
-          <w:i w:val="0"/>
-        </w:rPr>
         <w:t>Réplica estática (HTML/CSS/JS puro, sem framework) do site proferaldojunior.com.br, dentro de site/. Não tem build — os arquivos em site/assets/ são servidos diretamente. A única alteração feita nele foi adicionar o item de menu "Intranet Escritório", apontando para intranet/ (relativo a site/index.html).</w:t>
       </w:r>
     </w:p>
@@ -525,9 +337,6 @@
         <w:pStyle w:val="Heading2"/>
       </w:pPr>
       <w:r>
-        <w:rPr>
-          <w:color w:val="192742"/>
-        </w:rPr>
         <w:t>Intranet — aplicação React</w:t>
       </w:r>
     </w:p>
@@ -536,10 +345,6 @@
         <w:pStyle w:val="Heading3"/>
       </w:pPr>
       <w:r>
-        <w:rPr>
-          <w:color w:val="B59452"/>
-          <w:sz w:val="24"/>
-        </w:rPr>
         <w:t>Stack</w:t>
       </w:r>
     </w:p>
@@ -588,55 +393,57 @@
         <w:pStyle w:val="Heading3"/>
       </w:pPr>
       <w:r>
-        <w:rPr>
-          <w:color w:val="B59452"/>
-          <w:sz w:val="24"/>
-        </w:rPr>
         <w:t>Como rodar localmente</w:t>
       </w:r>
     </w:p>
     <w:p>
-      <w:pPr>
-        <w:ind w:left="283"/>
-      </w:pPr>
       <w:r>
-        <w:rPr>
-          <w:rFonts w:ascii="Consolas" w:hAnsi="Consolas"/>
-          <w:sz w:val="19"/>
-        </w:rPr>
         <w:t>cd intranet-app</w:t>
+      </w:r>
+      <w:r>
         <w:br/>
+      </w:r>
+      <w:r>
         <w:t>npm install</w:t>
+      </w:r>
+      <w:r>
         <w:br/>
+      </w:r>
+      <w:r>
         <w:t>npm run dev        # servidor de desenvolvimento (hot reload)</w:t>
+      </w:r>
+      <w:r>
         <w:br/>
+      </w:r>
+      <w:r>
         <w:t># ou</w:t>
+      </w:r>
+      <w:r>
         <w:br/>
+      </w:r>
+      <w:r>
         <w:t>npm run build       # gera intranet-app/dist</w:t>
       </w:r>
     </w:p>
     <w:p>
       <w:r>
-        <w:rPr>
-          <w:b w:val="0"/>
-          <w:i w:val="0"/>
-        </w:rPr>
         <w:t>Para testar o build de produção como um site estático:</w:t>
       </w:r>
     </w:p>
     <w:p>
-      <w:pPr>
-        <w:ind w:left="283"/>
-      </w:pPr>
       <w:r>
-        <w:rPr>
-          <w:rFonts w:ascii="Consolas" w:hAnsi="Consolas"/>
-          <w:sz w:val="19"/>
-        </w:rPr>
         <w:t>npm run build</w:t>
+      </w:r>
+      <w:r>
         <w:br/>
+      </w:r>
+      <w:r>
         <w:t>cd dist &amp;&amp; python3 -m http.server 8091</w:t>
+      </w:r>
+      <w:r>
         <w:br/>
+      </w:r>
+      <w:r>
         <w:t># abrir http://localhost:8091/</w:t>
       </w:r>
     </w:p>
@@ -645,20 +452,12 @@
         <w:pStyle w:val="Heading3"/>
       </w:pPr>
       <w:r>
-        <w:rPr>
-          <w:color w:val="B59452"/>
-          <w:sz w:val="24"/>
-        </w:rPr>
         <w:t>Login</w:t>
       </w:r>
     </w:p>
     <w:p>
       <w:r>
-        <w:rPr>
-          <w:b w:val="0"/>
-          <w:i w:val="0"/>
-        </w:rPr>
-        <w:t>A autenticação hoje é mockada no frontend (ver seção "O que é real e o que é mockado") — não há backend de autenticação real ainda. A credencial de teste usada para acessar o ambiente de demonstração fica em src/mocks/employees.ts (TEST_CREDENTIAL) e não é reproduzida aqui por questão de segurança.</w:t>
+        <w:t>A autenticação é real: o backend valida e-mail e senha (hash bcrypt) e devolve um token de sessão (JWT), que o frontend guarda em localStorage ("Manter conectado") ou sessionStorage. Não existe mais credencial fixa no código do frontend — cada usuário precisa ter uma senha definida no banco (ver backend/db/set_senha.py). O próprio usuário pode trocar a senha em Configurações → Segurança.</w:t>
       </w:r>
     </w:p>
     <w:p>
@@ -666,10 +465,6 @@
         <w:pStyle w:val="Heading3"/>
       </w:pPr>
       <w:r>
-        <w:rPr>
-          <w:color w:val="B59452"/>
-          <w:sz w:val="24"/>
-        </w:rPr>
         <w:t>Páginas / funcionalidades</w:t>
       </w:r>
     </w:p>
@@ -677,7 +472,6 @@
       <w:tblPr>
         <w:tblStyle w:val="LightGrid-Accent1"/>
         <w:tblW w:type="auto" w:w="0"/>
-        <w:jc w:val="center"/>
         <w:tblLook w:firstColumn="1" w:firstRow="1" w:lastColumn="0" w:lastRow="0" w:noHBand="0" w:noVBand="1" w:val="04A0"/>
       </w:tblPr>
       <w:tblGrid>
@@ -688,48 +482,30 @@
       <w:tr>
         <w:tc>
           <w:tcPr>
-            <w:tcW w:type="dxa" w:w="1984"/>
-            <w:shd w:fill="192742"/>
+            <w:tcW w:type="dxa" w:w="3324"/>
           </w:tcPr>
           <w:p>
-            <w:r/>
             <w:r>
-              <w:rPr>
-                <w:b/>
-                <w:color w:val="FFFFFF"/>
-              </w:rPr>
               <w:t>Página</w:t>
             </w:r>
           </w:p>
         </w:tc>
         <w:tc>
           <w:tcPr>
-            <w:tcW w:type="dxa" w:w="1984"/>
-            <w:shd w:fill="192742"/>
+            <w:tcW w:type="dxa" w:w="3324"/>
           </w:tcPr>
           <w:p>
-            <w:r/>
             <w:r>
-              <w:rPr>
-                <w:b/>
-                <w:color w:val="FFFFFF"/>
-              </w:rPr>
               <w:t>Rota</w:t>
             </w:r>
           </w:p>
         </w:tc>
         <w:tc>
           <w:tcPr>
-            <w:tcW w:type="dxa" w:w="5386"/>
-            <w:shd w:fill="192742"/>
+            <w:tcW w:type="dxa" w:w="3324"/>
           </w:tcPr>
           <w:p>
-            <w:r/>
             <w:r>
-              <w:rPr>
-                <w:b/>
-                <w:color w:val="FFFFFF"/>
-              </w:rPr>
               <w:t>O que faz</w:t>
             </w:r>
           </w:p>
@@ -738,48 +514,30 @@
       <w:tr>
         <w:tc>
           <w:tcPr>
-            <w:tcW w:type="dxa" w:w="1984"/>
+            <w:tcW w:type="dxa" w:w="3324"/>
           </w:tcPr>
           <w:p>
-            <w:pPr>
-              <w:spacing w:after="40"/>
-            </w:pPr>
             <w:r>
-              <w:rPr>
-                <w:sz w:val="19"/>
-              </w:rPr>
               <w:t>Login</w:t>
             </w:r>
           </w:p>
         </w:tc>
         <w:tc>
           <w:tcPr>
-            <w:tcW w:type="dxa" w:w="1984"/>
+            <w:tcW w:type="dxa" w:w="3324"/>
           </w:tcPr>
           <w:p>
-            <w:pPr>
-              <w:spacing w:after="40"/>
-            </w:pPr>
             <w:r>
-              <w:rPr>
-                <w:sz w:val="19"/>
-              </w:rPr>
               <w:t>/login</w:t>
             </w:r>
           </w:p>
         </w:tc>
         <w:tc>
           <w:tcPr>
-            <w:tcW w:type="dxa" w:w="5386"/>
+            <w:tcW w:type="dxa" w:w="3324"/>
           </w:tcPr>
           <w:p>
-            <w:pPr>
-              <w:spacing w:after="40"/>
-            </w:pPr>
             <w:r>
-              <w:rPr>
-                <w:sz w:val="19"/>
-              </w:rPr>
               <w:t>Tela de acesso, com animação de valores institucionais rotativos e transição de logo.</w:t>
             </w:r>
           </w:p>
@@ -788,48 +546,30 @@
       <w:tr>
         <w:tc>
           <w:tcPr>
-            <w:tcW w:type="dxa" w:w="1984"/>
+            <w:tcW w:type="dxa" w:w="3324"/>
           </w:tcPr>
           <w:p>
-            <w:pPr>
-              <w:spacing w:after="40"/>
-            </w:pPr>
             <w:r>
-              <w:rPr>
-                <w:sz w:val="19"/>
-              </w:rPr>
               <w:t>Dashboard</w:t>
             </w:r>
           </w:p>
         </w:tc>
         <w:tc>
           <w:tcPr>
-            <w:tcW w:type="dxa" w:w="1984"/>
+            <w:tcW w:type="dxa" w:w="3324"/>
           </w:tcPr>
           <w:p>
-            <w:pPr>
-              <w:spacing w:after="40"/>
-            </w:pPr>
             <w:r>
-              <w:rPr>
-                <w:sz w:val="19"/>
-              </w:rPr>
               <w:t>/</w:t>
             </w:r>
           </w:p>
         </w:tc>
         <w:tc>
           <w:tcPr>
-            <w:tcW w:type="dxa" w:w="5386"/>
+            <w:tcW w:type="dxa" w:w="3324"/>
           </w:tcPr>
           <w:p>
-            <w:pPr>
-              <w:spacing w:after="40"/>
-            </w:pPr>
             <w:r>
-              <w:rPr>
-                <w:sz w:val="19"/>
-              </w:rPr>
               <w:t>Visão geral personalizada por usuário logado, com mini-gráficos (sparkline) nos indicadores.</w:t>
             </w:r>
           </w:p>
@@ -838,48 +578,30 @@
       <w:tr>
         <w:tc>
           <w:tcPr>
-            <w:tcW w:type="dxa" w:w="1984"/>
+            <w:tcW w:type="dxa" w:w="3324"/>
           </w:tcPr>
           <w:p>
-            <w:pPr>
-              <w:spacing w:after="40"/>
-            </w:pPr>
             <w:r>
-              <w:rPr>
-                <w:sz w:val="19"/>
-              </w:rPr>
               <w:t>Meu Authenticator</w:t>
             </w:r>
           </w:p>
         </w:tc>
         <w:tc>
           <w:tcPr>
-            <w:tcW w:type="dxa" w:w="1984"/>
+            <w:tcW w:type="dxa" w:w="3324"/>
           </w:tcPr>
           <w:p>
-            <w:pPr>
-              <w:spacing w:after="40"/>
-            </w:pPr>
             <w:r>
-              <w:rPr>
-                <w:sz w:val="19"/>
-              </w:rPr>
               <w:t>/meu-authenticator</w:t>
             </w:r>
           </w:p>
         </w:tc>
         <w:tc>
           <w:tcPr>
-            <w:tcW w:type="dxa" w:w="5386"/>
+            <w:tcW w:type="dxa" w:w="3324"/>
           </w:tcPr>
           <w:p>
-            <w:pPr>
-              <w:spacing w:after="40"/>
-            </w:pPr>
             <w:r>
-              <w:rPr>
-                <w:sz w:val="19"/>
-              </w:rPr>
               <w:t>Códigos TOTP de contas de serviço, via backend Python real.</w:t>
             </w:r>
           </w:p>
@@ -888,48 +610,30 @@
       <w:tr>
         <w:tc>
           <w:tcPr>
-            <w:tcW w:type="dxa" w:w="1984"/>
+            <w:tcW w:type="dxa" w:w="3324"/>
           </w:tcPr>
           <w:p>
-            <w:pPr>
-              <w:spacing w:after="40"/>
-            </w:pPr>
             <w:r>
-              <w:rPr>
-                <w:sz w:val="19"/>
-              </w:rPr>
               <w:t>Assistente IA</w:t>
             </w:r>
           </w:p>
         </w:tc>
         <w:tc>
           <w:tcPr>
-            <w:tcW w:type="dxa" w:w="1984"/>
+            <w:tcW w:type="dxa" w:w="3324"/>
           </w:tcPr>
           <w:p>
-            <w:pPr>
-              <w:spacing w:after="40"/>
-            </w:pPr>
             <w:r>
-              <w:rPr>
-                <w:sz w:val="19"/>
-              </w:rPr>
               <w:t>/assistente-ia</w:t>
             </w:r>
           </w:p>
         </w:tc>
         <w:tc>
           <w:tcPr>
-            <w:tcW w:type="dxa" w:w="5386"/>
+            <w:tcW w:type="dxa" w:w="3324"/>
           </w:tcPr>
           <w:p>
-            <w:pPr>
-              <w:spacing w:after="40"/>
-            </w:pPr>
             <w:r>
-              <w:rPr>
-                <w:sz w:val="19"/>
-              </w:rPr>
               <w:t>Chat com duas sub-abas: "Processos Gerais" (busca real na documentação interna) e "Comunicação" (ajuda a redigir avisos/e-mails, mockado).</w:t>
             </w:r>
           </w:p>
@@ -938,48 +642,30 @@
       <w:tr>
         <w:tc>
           <w:tcPr>
-            <w:tcW w:type="dxa" w:w="1984"/>
+            <w:tcW w:type="dxa" w:w="3324"/>
           </w:tcPr>
           <w:p>
-            <w:pPr>
-              <w:spacing w:after="40"/>
-            </w:pPr>
             <w:r>
-              <w:rPr>
-                <w:sz w:val="19"/>
-              </w:rPr>
               <w:t>Base de Conhecimento</w:t>
             </w:r>
           </w:p>
         </w:tc>
         <w:tc>
           <w:tcPr>
-            <w:tcW w:type="dxa" w:w="1984"/>
+            <w:tcW w:type="dxa" w:w="3324"/>
           </w:tcPr>
           <w:p>
-            <w:pPr>
-              <w:spacing w:after="40"/>
-            </w:pPr>
             <w:r>
-              <w:rPr>
-                <w:sz w:val="19"/>
-              </w:rPr>
               <w:t>/base-conhecimento</w:t>
             </w:r>
           </w:p>
         </w:tc>
         <w:tc>
           <w:tcPr>
-            <w:tcW w:type="dxa" w:w="5386"/>
+            <w:tcW w:type="dxa" w:w="3324"/>
           </w:tcPr>
           <w:p>
-            <w:pPr>
-              <w:spacing w:after="40"/>
-            </w:pPr>
             <w:r>
-              <w:rPr>
-                <w:sz w:val="19"/>
-              </w:rPr>
               <w:t>Artigos internos, filtráveis por categoria e busca.</w:t>
             </w:r>
           </w:p>
@@ -988,49 +674,31 @@
       <w:tr>
         <w:tc>
           <w:tcPr>
-            <w:tcW w:type="dxa" w:w="1984"/>
+            <w:tcW w:type="dxa" w:w="3324"/>
           </w:tcPr>
           <w:p>
-            <w:pPr>
-              <w:spacing w:after="40"/>
-            </w:pPr>
             <w:r>
-              <w:rPr>
-                <w:sz w:val="19"/>
-              </w:rPr>
               <w:t>Calendário do Escritório</w:t>
             </w:r>
           </w:p>
         </w:tc>
         <w:tc>
           <w:tcPr>
-            <w:tcW w:type="dxa" w:w="1984"/>
+            <w:tcW w:type="dxa" w:w="3324"/>
           </w:tcPr>
           <w:p>
-            <w:pPr>
-              <w:spacing w:after="40"/>
-            </w:pPr>
             <w:r>
-              <w:rPr>
-                <w:sz w:val="19"/>
-              </w:rPr>
               <w:t>/calendario</w:t>
             </w:r>
           </w:p>
         </w:tc>
         <w:tc>
           <w:tcPr>
-            <w:tcW w:type="dxa" w:w="5386"/>
+            <w:tcW w:type="dxa" w:w="3324"/>
           </w:tcPr>
           <w:p>
-            <w:pPr>
-              <w:spacing w:after="40"/>
-            </w:pPr>
             <w:r>
-              <w:rPr>
-                <w:sz w:val="19"/>
-              </w:rPr>
-              <w:t>Agenda (grade semanal por horário, com anotações pessoais e alerta 10 min antes), férias, aniversários, feriados, avisos, funcionários e onboarding — tudo em uma única entrada da sidebar, organizado em abas.</w:t>
+              <w:t>Agenda (grade semanal por horário, com anotações pessoais e alerta 10 min antes — ambos reais, persistem no banco), férias, aniversários, feriados, avisos, funcionários e onboarding — tudo em uma única entrada da sidebar, organizado em abas.</w:t>
             </w:r>
           </w:p>
         </w:tc>
@@ -1038,48 +706,30 @@
       <w:tr>
         <w:tc>
           <w:tcPr>
-            <w:tcW w:type="dxa" w:w="1984"/>
+            <w:tcW w:type="dxa" w:w="3324"/>
           </w:tcPr>
           <w:p>
-            <w:pPr>
-              <w:spacing w:after="40"/>
-            </w:pPr>
             <w:r>
-              <w:rPr>
-                <w:sz w:val="19"/>
-              </w:rPr>
               <w:t>Manual Interno</w:t>
             </w:r>
           </w:p>
         </w:tc>
         <w:tc>
           <w:tcPr>
-            <w:tcW w:type="dxa" w:w="1984"/>
+            <w:tcW w:type="dxa" w:w="3324"/>
           </w:tcPr>
           <w:p>
-            <w:pPr>
-              <w:spacing w:after="40"/>
-            </w:pPr>
             <w:r>
-              <w:rPr>
-                <w:sz w:val="19"/>
-              </w:rPr>
               <w:t>/manual</w:t>
             </w:r>
           </w:p>
         </w:tc>
         <w:tc>
           <w:tcPr>
-            <w:tcW w:type="dxa" w:w="5386"/>
+            <w:tcW w:type="dxa" w:w="3324"/>
           </w:tcPr>
           <w:p>
-            <w:pPr>
-              <w:spacing w:after="40"/>
-            </w:pPr>
             <w:r>
-              <w:rPr>
-                <w:sz w:val="19"/>
-              </w:rPr>
               <w:t>Manual da empresa, por capítulos.</w:t>
             </w:r>
           </w:p>
@@ -1088,48 +738,30 @@
       <w:tr>
         <w:tc>
           <w:tcPr>
-            <w:tcW w:type="dxa" w:w="1984"/>
+            <w:tcW w:type="dxa" w:w="3324"/>
           </w:tcPr>
           <w:p>
-            <w:pPr>
-              <w:spacing w:after="40"/>
-            </w:pPr>
             <w:r>
-              <w:rPr>
-                <w:sz w:val="19"/>
-              </w:rPr>
               <w:t>Documentos</w:t>
             </w:r>
           </w:p>
         </w:tc>
         <w:tc>
           <w:tcPr>
-            <w:tcW w:type="dxa" w:w="1984"/>
+            <w:tcW w:type="dxa" w:w="3324"/>
           </w:tcPr>
           <w:p>
-            <w:pPr>
-              <w:spacing w:after="40"/>
-            </w:pPr>
             <w:r>
-              <w:rPr>
-                <w:sz w:val="19"/>
-              </w:rPr>
               <w:t>/documentos</w:t>
             </w:r>
           </w:p>
         </w:tc>
         <w:tc>
           <w:tcPr>
-            <w:tcW w:type="dxa" w:w="5386"/>
+            <w:tcW w:type="dxa" w:w="3324"/>
           </w:tcPr>
           <w:p>
-            <w:pPr>
-              <w:spacing w:after="40"/>
-            </w:pPr>
             <w:r>
-              <w:rPr>
-                <w:sz w:val="19"/>
-              </w:rPr>
               <w:t>Biblioteca de documentos, com prévia em modal.</w:t>
             </w:r>
           </w:p>
@@ -1138,48 +770,30 @@
       <w:tr>
         <w:tc>
           <w:tcPr>
-            <w:tcW w:type="dxa" w:w="1984"/>
+            <w:tcW w:type="dxa" w:w="3324"/>
           </w:tcPr>
           <w:p>
-            <w:pPr>
-              <w:spacing w:after="40"/>
-            </w:pPr>
             <w:r>
-              <w:rPr>
-                <w:sz w:val="19"/>
-              </w:rPr>
               <w:t>Cooperativa de Ideias</w:t>
             </w:r>
           </w:p>
         </w:tc>
         <w:tc>
           <w:tcPr>
-            <w:tcW w:type="dxa" w:w="1984"/>
+            <w:tcW w:type="dxa" w:w="3324"/>
           </w:tcPr>
           <w:p>
-            <w:pPr>
-              <w:spacing w:after="40"/>
-            </w:pPr>
             <w:r>
-              <w:rPr>
-                <w:sz w:val="19"/>
-              </w:rPr>
               <w:t>/cooperativa-ideias</w:t>
             </w:r>
           </w:p>
         </w:tc>
         <w:tc>
           <w:tcPr>
-            <w:tcW w:type="dxa" w:w="5386"/>
+            <w:tcW w:type="dxa" w:w="3324"/>
           </w:tcPr>
           <w:p>
-            <w:pPr>
-              <w:spacing w:after="40"/>
-            </w:pPr>
             <w:r>
-              <w:rPr>
-                <w:sz w:val="19"/>
-              </w:rPr>
               <w:t>Colaboradores sugerem ideias de conteúdo para redes sociais (posts, reels, stories etc.); equipe de marketing acompanha por status (nova, em análise, aprovada, em produção, publicada, não aprovada).</w:t>
             </w:r>
           </w:p>
@@ -1188,48 +802,30 @@
       <w:tr>
         <w:tc>
           <w:tcPr>
-            <w:tcW w:type="dxa" w:w="1984"/>
+            <w:tcW w:type="dxa" w:w="3324"/>
           </w:tcPr>
           <w:p>
-            <w:pPr>
-              <w:spacing w:after="40"/>
-            </w:pPr>
             <w:r>
-              <w:rPr>
-                <w:sz w:val="19"/>
-              </w:rPr>
               <w:t>Tribunais</w:t>
             </w:r>
           </w:p>
         </w:tc>
         <w:tc>
           <w:tcPr>
-            <w:tcW w:type="dxa" w:w="1984"/>
+            <w:tcW w:type="dxa" w:w="3324"/>
           </w:tcPr>
           <w:p>
-            <w:pPr>
-              <w:spacing w:after="40"/>
-            </w:pPr>
             <w:r>
-              <w:rPr>
-                <w:sz w:val="19"/>
-              </w:rPr>
               <w:t>/tribunais</w:t>
             </w:r>
           </w:p>
         </w:tc>
         <w:tc>
           <w:tcPr>
-            <w:tcW w:type="dxa" w:w="5386"/>
+            <w:tcW w:type="dxa" w:w="3324"/>
           </w:tcPr>
           <w:p>
-            <w:pPr>
-              <w:spacing w:after="40"/>
-            </w:pPr>
             <w:r>
-              <w:rPr>
-                <w:sz w:val="19"/>
-              </w:rPr>
               <w:t>Links rápidos para tribunais e sistemas usados no dia a dia.</w:t>
             </w:r>
           </w:p>
@@ -1238,48 +834,30 @@
       <w:tr>
         <w:tc>
           <w:tcPr>
-            <w:tcW w:type="dxa" w:w="1984"/>
+            <w:tcW w:type="dxa" w:w="3324"/>
           </w:tcPr>
           <w:p>
-            <w:pPr>
-              <w:spacing w:after="40"/>
-            </w:pPr>
             <w:r>
-              <w:rPr>
-                <w:sz w:val="19"/>
-              </w:rPr>
               <w:t>Solicitações</w:t>
             </w:r>
           </w:p>
         </w:tc>
         <w:tc>
           <w:tcPr>
-            <w:tcW w:type="dxa" w:w="1984"/>
+            <w:tcW w:type="dxa" w:w="3324"/>
           </w:tcPr>
           <w:p>
-            <w:pPr>
-              <w:spacing w:after="40"/>
-            </w:pPr>
             <w:r>
-              <w:rPr>
-                <w:sz w:val="19"/>
-              </w:rPr>
               <w:t>/solicitacoes</w:t>
             </w:r>
           </w:p>
         </w:tc>
         <w:tc>
           <w:tcPr>
-            <w:tcW w:type="dxa" w:w="5386"/>
+            <w:tcW w:type="dxa" w:w="3324"/>
           </w:tcPr>
           <w:p>
-            <w:pPr>
-              <w:spacing w:after="40"/>
-            </w:pPr>
             <w:r>
-              <w:rPr>
-                <w:sz w:val="19"/>
-              </w:rPr>
               <w:t>Central de chamados internos, com modal de nova solicitação.</w:t>
             </w:r>
           </w:p>
@@ -1288,48 +866,30 @@
       <w:tr>
         <w:tc>
           <w:tcPr>
-            <w:tcW w:type="dxa" w:w="1984"/>
+            <w:tcW w:type="dxa" w:w="3324"/>
           </w:tcPr>
           <w:p>
-            <w:pPr>
-              <w:spacing w:after="40"/>
-            </w:pPr>
             <w:r>
-              <w:rPr>
-                <w:sz w:val="19"/>
-              </w:rPr>
               <w:t>Notificações</w:t>
             </w:r>
           </w:p>
         </w:tc>
         <w:tc>
           <w:tcPr>
-            <w:tcW w:type="dxa" w:w="1984"/>
+            <w:tcW w:type="dxa" w:w="3324"/>
           </w:tcPr>
           <w:p>
-            <w:pPr>
-              <w:spacing w:after="40"/>
-            </w:pPr>
             <w:r>
-              <w:rPr>
-                <w:sz w:val="19"/>
-              </w:rPr>
               <w:t>/notificacoes</w:t>
             </w:r>
           </w:p>
         </w:tc>
         <w:tc>
           <w:tcPr>
-            <w:tcW w:type="dxa" w:w="5386"/>
+            <w:tcW w:type="dxa" w:w="3324"/>
           </w:tcPr>
           <w:p>
-            <w:pPr>
-              <w:spacing w:after="40"/>
-            </w:pPr>
             <w:r>
-              <w:rPr>
-                <w:sz w:val="19"/>
-              </w:rPr>
               <w:t>Central de notificações.</w:t>
             </w:r>
           </w:p>
@@ -1338,48 +898,30 @@
       <w:tr>
         <w:tc>
           <w:tcPr>
-            <w:tcW w:type="dxa" w:w="1984"/>
+            <w:tcW w:type="dxa" w:w="3324"/>
           </w:tcPr>
           <w:p>
-            <w:pPr>
-              <w:spacing w:after="40"/>
-            </w:pPr>
             <w:r>
-              <w:rPr>
-                <w:sz w:val="19"/>
-              </w:rPr>
               <w:t>Meu Perfil</w:t>
             </w:r>
           </w:p>
         </w:tc>
         <w:tc>
           <w:tcPr>
-            <w:tcW w:type="dxa" w:w="1984"/>
+            <w:tcW w:type="dxa" w:w="3324"/>
           </w:tcPr>
           <w:p>
-            <w:pPr>
-              <w:spacing w:after="40"/>
-            </w:pPr>
             <w:r>
-              <w:rPr>
-                <w:sz w:val="19"/>
-              </w:rPr>
               <w:t>/perfil</w:t>
             </w:r>
           </w:p>
         </w:tc>
         <w:tc>
           <w:tcPr>
-            <w:tcW w:type="dxa" w:w="5386"/>
+            <w:tcW w:type="dxa" w:w="3324"/>
           </w:tcPr>
           <w:p>
-            <w:pPr>
-              <w:spacing w:after="40"/>
-            </w:pPr>
             <w:r>
-              <w:rPr>
-                <w:sz w:val="19"/>
-              </w:rPr>
               <w:t>Perfil do usuário logado.</w:t>
             </w:r>
           </w:p>
@@ -1388,49 +930,31 @@
       <w:tr>
         <w:tc>
           <w:tcPr>
-            <w:tcW w:type="dxa" w:w="1984"/>
+            <w:tcW w:type="dxa" w:w="3324"/>
           </w:tcPr>
           <w:p>
-            <w:pPr>
-              <w:spacing w:after="40"/>
-            </w:pPr>
             <w:r>
-              <w:rPr>
-                <w:sz w:val="19"/>
-              </w:rPr>
               <w:t>Configurações</w:t>
             </w:r>
           </w:p>
         </w:tc>
         <w:tc>
           <w:tcPr>
-            <w:tcW w:type="dxa" w:w="1984"/>
+            <w:tcW w:type="dxa" w:w="3324"/>
           </w:tcPr>
           <w:p>
-            <w:pPr>
-              <w:spacing w:after="40"/>
-            </w:pPr>
             <w:r>
-              <w:rPr>
-                <w:sz w:val="19"/>
-              </w:rPr>
               <w:t>/configuracoes</w:t>
             </w:r>
           </w:p>
         </w:tc>
         <w:tc>
           <w:tcPr>
-            <w:tcW w:type="dxa" w:w="5386"/>
+            <w:tcW w:type="dxa" w:w="3324"/>
           </w:tcPr>
           <w:p>
-            <w:pPr>
-              <w:spacing w:after="40"/>
-            </w:pPr>
             <w:r>
-              <w:rPr>
-                <w:sz w:val="19"/>
-              </w:rPr>
-              <w:t>Preferências da conta.</w:t>
+              <w:t>Preferências da conta, incluindo troca de senha.</w:t>
             </w:r>
           </w:p>
         </w:tc>
@@ -1438,48 +962,30 @@
       <w:tr>
         <w:tc>
           <w:tcPr>
-            <w:tcW w:type="dxa" w:w="1984"/>
+            <w:tcW w:type="dxa" w:w="3324"/>
           </w:tcPr>
           <w:p>
-            <w:pPr>
-              <w:spacing w:after="40"/>
-            </w:pPr>
             <w:r>
-              <w:rPr>
-                <w:sz w:val="19"/>
-              </w:rPr>
               <w:t>Administração*</w:t>
             </w:r>
           </w:p>
         </w:tc>
         <w:tc>
           <w:tcPr>
-            <w:tcW w:type="dxa" w:w="1984"/>
+            <w:tcW w:type="dxa" w:w="3324"/>
           </w:tcPr>
           <w:p>
-            <w:pPr>
-              <w:spacing w:after="40"/>
-            </w:pPr>
             <w:r>
-              <w:rPr>
-                <w:sz w:val="19"/>
-              </w:rPr>
               <w:t>/administracao</w:t>
             </w:r>
           </w:p>
         </w:tc>
         <w:tc>
           <w:tcPr>
-            <w:tcW w:type="dxa" w:w="5386"/>
+            <w:tcW w:type="dxa" w:w="3324"/>
           </w:tcPr>
           <w:p>
-            <w:pPr>
-              <w:spacing w:after="40"/>
-            </w:pPr>
             <w:r>
-              <w:rPr>
-                <w:sz w:val="19"/>
-              </w:rPr>
               <w:t>Painel administrativo (stats, módulos, perguntas mais feitas à IA).</w:t>
             </w:r>
           </w:p>
@@ -1488,81 +994,54 @@
       <w:tr>
         <w:tc>
           <w:tcPr>
-            <w:tcW w:type="dxa" w:w="1984"/>
+            <w:tcW w:type="dxa" w:w="3324"/>
           </w:tcPr>
           <w:p>
-            <w:pPr>
-              <w:spacing w:after="40"/>
-            </w:pPr>
             <w:r>
-              <w:rPr>
-                <w:sz w:val="19"/>
-              </w:rPr>
               <w:t>Usuários e Permissões*</w:t>
             </w:r>
           </w:p>
         </w:tc>
         <w:tc>
           <w:tcPr>
-            <w:tcW w:type="dxa" w:w="1984"/>
+            <w:tcW w:type="dxa" w:w="3324"/>
           </w:tcPr>
           <w:p>
-            <w:pPr>
-              <w:spacing w:after="40"/>
-            </w:pPr>
             <w:r>
-              <w:rPr>
-                <w:sz w:val="19"/>
-              </w:rPr>
               <w:t>/administracao/usuarios</w:t>
             </w:r>
           </w:p>
         </w:tc>
         <w:tc>
           <w:tcPr>
-            <w:tcW w:type="dxa" w:w="5386"/>
+            <w:tcW w:type="dxa" w:w="3324"/>
           </w:tcPr>
           <w:p>
-            <w:pPr>
-              <w:spacing w:after="40"/>
-            </w:pPr>
             <w:r>
-              <w:rPr>
-                <w:sz w:val="19"/>
-              </w:rPr>
               <w:t>Lista de perfis de acesso.</w:t>
             </w:r>
           </w:p>
         </w:tc>
       </w:tr>
     </w:tbl>
-    <w:p/>
     <w:p>
       <w:r>
-        <w:rPr>
-          <w:b w:val="0"/>
-          <w:i/>
-          <w:color w:val="6C727C"/>
-        </w:rPr>
         <w:t>* Só visível para usuários com perfil ADMINISTRADOR.</w:t>
       </w:r>
     </w:p>
     <w:p>
       <w:r>
-        <w:rPr>
-          <w:b w:val="0"/>
-          <w:i w:val="0"/>
-        </w:rPr>
         <w:t>O perfil individual de um funcionário (/funcionarios/:id) continua sendo uma rota própria — é uma tela de detalhe, acessada a partir da aba "Funcionários" dentro do Calendário do Escritório, não um item de menu.</w:t>
       </w:r>
     </w:p>
     <w:p>
       <w:r>
-        <w:rPr>
-          <w:b w:val="0"/>
-          <w:i w:val="0"/>
-        </w:rPr>
-        <w:t>A página "Audiências" existiu como item próprio da sidebar e foi removida a pedido do escritório; os dados de audiências (mock hearings.ts) continuam em uso em outros pontos que não dependiam daquela rota — o card "Minhas audiências próximas" no Dashboard, o indicador "Audiências" na Administração e a lista de audiências no perfil de cada funcionário.</w:t>
+        <w:t>A página "Audiências" existiu como item próprio da sidebar e foi removida a pedido do escritório; a tabela audiencias existe no schema do banco, mas sem nenhuma API ou página ligada a ela — os dados de audiências que ainda aparecem em outros pontos (card no Dashboard, indicador na Administração, lista no perfil de cada funcionário) continuam vindo do mock hearings.ts, não do banco.</w:t>
+      </w:r>
+    </w:p>
+    <w:p>
+      <w:r>
+        <w:t>Nesta fase da migração para banco de dados real, a maioria dos módulos acima já lê e grava no Postgres (Supabase); Dashboard, Administração e Meu Perfil ainda combinam dados mockados — ver "O que é real e o que é mockado" para o detalhe módulo a módulo.</w:t>
       </w:r>
     </w:p>
     <w:p>
@@ -1570,72 +1049,11 @@
         <w:pStyle w:val="Heading3"/>
       </w:pPr>
       <w:r>
-        <w:rPr>
-          <w:color w:val="B59452"/>
-          <w:sz w:val="24"/>
-        </w:rPr>
-        <w:t>Agenda — grade semanal com anotações e alerta</w:t>
-      </w:r>
-    </w:p>
-    <w:p>
-      <w:r>
-        <w:rPr>
-          <w:b w:val="0"/>
-          <w:i w:val="0"/>
-        </w:rPr>
-        <w:t>A aba Agenda (dentro de Calendário do Escritório) é uma grade de horários por semana (estilo agenda de calendário: coluna de horas de 07:00 a 20:00, uma coluna por dia), não uma lista simples.</w:t>
-      </w:r>
-    </w:p>
-    <w:p>
-      <w:pPr>
-        <w:pStyle w:val="ListBullet"/>
-      </w:pPr>
-      <w:r>
-        <w:t>Compromissos cadastrados (mocks/agenda.ts) aparecem como blocos na hora certa.</w:t>
-      </w:r>
-    </w:p>
-    <w:p>
-      <w:pPr>
-        <w:pStyle w:val="ListBullet"/>
-      </w:pPr>
-      <w:r>
-        <w:t>Clicar em qualquer horário vazio abre uma anotação livre ali mesmo, salva no navegador (localStorage, por dia) — não é persistida em backend.</w:t>
-      </w:r>
-    </w:p>
-    <w:p>
-      <w:pPr>
-        <w:pStyle w:val="ListBullet"/>
-      </w:pPr>
-      <w:r>
-        <w:t>AgendaAlerts (montado em AppLayout, ativo em qualquer página) verifica a cada 20s os compromissos e anotações do dia; quando falta 10 minutos ou menos, dispara um toast visual (10s de duração) e um som curto (dois bips via Web Audio API, sem arquivo de áudio externo).</w:t>
-      </w:r>
-    </w:p>
-    <w:p>
-      <w:pPr>
-        <w:pStyle w:val="ListBullet"/>
-      </w:pPr>
-      <w:r>
-        <w:t>Limitação: como é tudo client-side, o alerta só funciona enquanto a aba da intranet estiver aberta no navegador — não há e-mail nem notificação do sistema operacional.</w:t>
-      </w:r>
-    </w:p>
-    <w:p>
-      <w:pPr>
-        <w:pStyle w:val="Heading3"/>
-      </w:pPr>
-      <w:r>
-        <w:rPr>
-          <w:color w:val="B59452"/>
-          <w:sz w:val="24"/>
-        </w:rPr>
         <w:t>Componentes reutilizáveis principais</w:t>
       </w:r>
     </w:p>
     <w:p>
       <w:r>
-        <w:rPr>
-          <w:b w:val="0"/>
-          <w:i w:val="0"/>
-        </w:rPr>
         <w:t>Card, Button (com estados loading/success animado), Modal, Drawer, Skeleton (com efeito shimmer), RouteSkeleton (fallback do carregamento sob demanda), Sparkline (mini-gráfico SVG usado no Dashboard), Badge, Avatar, Toast (sistema de notificações de ação, com duração configurável), Sidebar (recolhível, com logo real e tooltip animado quando fechada), Header (busca + notificações + menu do usuário).</w:t>
       </w:r>
     </w:p>
@@ -1644,20 +1062,12 @@
         <w:pStyle w:val="Heading3"/>
       </w:pPr>
       <w:r>
-        <w:rPr>
-          <w:color w:val="B59452"/>
-          <w:sz w:val="24"/>
-        </w:rPr>
         <w:t>Personalização por usuário</w:t>
       </w:r>
     </w:p>
     <w:p>
       <w:r>
-        <w:rPr>
-          <w:b w:val="0"/>
-          <w:i w:val="0"/>
-        </w:rPr>
-        <w:t>O Dashboard usa useAuth() para filtrar dados pelo usuário logado (user.nome) — cada pessoa que logar vê as próprias audiências e agenda, não os dados do escritório inteiro. Como hoje só existe uma credencial de teste (Eraldo Júnior, perfil ADMINISTRADOR), o efeito só é visível de fato quando outro funcionário fizer login — a lógica já está pronta pra isso em src/mocks/employees.ts (7 outros funcionários cadastrados lá, sem senha de login configurada ainda).</w:t>
+        <w:t>O Dashboard usa useAuth() para filtrar dados pelo usuário logado, mas ainda a partir de arrays mockados — a personalização em si funciona (cada pessoa vê o que é dela), só a fonte de dado é que ainda não é o banco real nesta tela específica.</w:t>
       </w:r>
     </w:p>
     <w:p>
@@ -1665,18 +1075,11 @@
         <w:pStyle w:val="Heading2"/>
       </w:pPr>
       <w:r>
-        <w:rPr>
-          <w:color w:val="192742"/>
-        </w:rPr>
         <w:t>Navegação e performance</w:t>
       </w:r>
     </w:p>
     <w:p>
       <w:r>
-        <w:rPr>
-          <w:b w:val="0"/>
-          <w:i w:val="0"/>
-        </w:rPr>
         <w:t>A troca de página segue um princípio simples: clicar precisa parecer instantâneo, a animação nunca pode ser o motivo de uma tela demorar a responder. Na prática:</w:t>
       </w:r>
     </w:p>
@@ -1725,18 +1128,11 @@
         <w:pStyle w:val="Heading2"/>
       </w:pPr>
       <w:r>
-        <w:rPr>
-          <w:color w:val="192742"/>
-        </w:rPr>
         <w:t>Responsividade mobile</w:t>
       </w:r>
     </w:p>
     <w:p>
       <w:r>
-        <w:rPr>
-          <w:b w:val="0"/>
-          <w:i w:val="0"/>
-        </w:rPr>
         <w:t>Revisão dedicada pra celular: quando um recurso não cabia na tela pequena, a solução foi adaptar o layout, não simplesmente esconder a funcionalidade ou a animação.</w:t>
       </w:r>
     </w:p>
@@ -1785,19 +1181,44 @@
         <w:pStyle w:val="Heading2"/>
       </w:pPr>
       <w:r>
-        <w:rPr>
-          <w:color w:val="192742"/>
-        </w:rPr>
-        <w:t>Backend Python — Meu Authenticator e Assistente IA</w:t>
+        <w:t>Backend Python — arquitetura</w:t>
       </w:r>
     </w:p>
     <w:p>
       <w:r>
-        <w:rPr>
-          <w:b w:val="0"/>
-          <w:i w:val="0"/>
-        </w:rPr>
-        <w:t>Um único processo FastAPI (backend/main.py) serve dois routers independentes, protegidos pela mesma X-API-Key (backend/security.py).</w:t>
+        <w:t>Um único processo FastAPI (backend/main.py) serve todos os módulos da intranet, protegidos por uma X-API-Key compartilhada (backend/security.py) — e, para os que agem em nome de um usuário específico, também por um token de sessão (JWT).</w:t>
+      </w:r>
+    </w:p>
+    <w:p>
+      <w:pPr>
+        <w:pStyle w:val="ListBullet"/>
+      </w:pPr>
+      <w:r>
+        <w:t>config.py centraliza toda variável de ambiente (antes cada módulo lia os.getenv por conta própria)</w:t>
+      </w:r>
+    </w:p>
+    <w:p>
+      <w:pPr>
+        <w:pStyle w:val="ListBullet"/>
+      </w:pPr>
+      <w:r>
+        <w:t>database.py mantém um pool de conexões (ThreadedConnectionPool) com o Postgres, aberto/fechado no ciclo de vida do FastAPI (lifespan) — uma conexão que sofre erro passa por rollback antes de voltar pro pool, pra não deixar a próxima requisição que reusar essa conexão física com uma transação abortada</w:t>
+      </w:r>
+    </w:p>
+    <w:p>
+      <w:pPr>
+        <w:pStyle w:val="ListBullet"/>
+      </w:pPr>
+      <w:r>
+        <w:t>routers/ tem um arquivo por módulo de dados (funcionarios, ferias, feriados, agenda, agenda_anotacoes, avisos, solicitacoes, documentos, cooperativa_ideias, tribunais, base_conhecimento, manual_interno, notificacoes, onboarding, auth)</w:t>
+      </w:r>
+    </w:p>
+    <w:p>
+      <w:pPr>
+        <w:pStyle w:val="ListBullet"/>
+      </w:pPr>
+      <w:r>
+        <w:t>Tratamento de erro genérico (@app.exception_handler(Exception)) devolve sempre {"detail": "..."} com HTTP 500 pra qualquer falha não tratada, no mesmo formato que o frontend já sabe interpretar</w:t>
       </w:r>
     </w:p>
     <w:p>
@@ -1805,19 +1226,11 @@
         <w:pStyle w:val="Heading3"/>
       </w:pPr>
       <w:r>
-        <w:rPr>
-          <w:color w:val="B59452"/>
-          <w:sz w:val="24"/>
-        </w:rPr>
         <w:t>Meu Authenticator</w:t>
       </w:r>
     </w:p>
     <w:p>
       <w:r>
-        <w:rPr>
-          <w:b w:val="0"/>
-          <w:i w:val="0"/>
-        </w:rPr>
         <w:t>API mínima que calcula códigos TOTP (RFC 6238) a partir de segredos guardados só no servidor — o frontend nunca recebe a chave secreta, só o código de 6 dígitos já calculado.</w:t>
       </w:r>
     </w:p>
@@ -1826,19 +1239,11 @@
         <w:pStyle w:val="Heading3"/>
       </w:pPr>
       <w:r>
-        <w:rPr>
-          <w:color w:val="B59452"/>
-          <w:sz w:val="24"/>
-        </w:rPr>
         <w:t>Assistente IA — busca semântica na documentação interna</w:t>
       </w:r>
     </w:p>
     <w:p>
       <w:r>
-        <w:rPr>
-          <w:b w:val="0"/>
-          <w:i w:val="0"/>
-        </w:rPr>
         <w:t>A aba "Processos Gerais" do Assistente IA consulta uma base de documentação interna de verdade via busca semântica (RAG), em vez do antigo mock por palavra-chave. Por decisão explícita, a arquitetura não usa nenhum modelo de linguagem (LLM) por enquanto: a "resposta" é o próprio trecho mais relevante da documentação, devolvido tal como está escrito, com a fonte indicada — zero custo por pergunta, zero risco de invenção. Fica pronta para, no futuro, plugar um LLM (Claude, OpenAI ou Ollama local) só para reescrever o trecho de forma mais natural, sem redesenhar nada.</w:t>
       </w:r>
     </w:p>
@@ -1871,7 +1276,7 @@
         <w:pStyle w:val="ListBullet"/>
       </w:pPr>
       <w:r>
-        <w:t>Endpoint: POST /api/assistant/ask — mesma X-API-Key do Meu Authenticator</w:t>
+        <w:t>Endpoint: POST /api/assistant/ask — mesma X-API-Key dos demais módulos</w:t>
       </w:r>
     </w:p>
     <w:p>
@@ -1883,43 +1288,16 @@
       </w:r>
     </w:p>
     <w:p>
-      <w:r>
-        <w:rPr>
-          <w:b w:val="0"/>
-          <w:i w:val="0"/>
-        </w:rPr>
-        <w:t>Testado de ponta a ponta: a indexação dos documentos roda com sucesso e perguntas parafraseadas (não o texto exato dos documentos, ex.: "posso tirar férias quando?") retornam o trecho certo com a fonte correta; perguntas fora de escopo (ex.: "qual a capital da França?") corretamente caem na mensagem de "não encontrei". No caminho, trocamos o modelo de embedding inicial (MiniLM, menor) por este maior — o menor confundia buscas óbvias, como "sistemas usados" retornando o documento de horário de expediente.</w:t>
-      </w:r>
-    </w:p>
-    <w:p>
       <w:pPr>
-        <w:ind w:left="283"/>
+        <w:pStyle w:val="Heading2"/>
       </w:pPr>
       <w:r>
-        <w:rPr>
-          <w:rFonts w:ascii="Consolas" w:hAnsi="Consolas"/>
-          <w:sz w:val="19"/>
-        </w:rPr>
-        <w:t>cd backend</w:t>
-        <w:br/>
-        <w:t>python3 -m venv venv</w:t>
-        <w:br/>
-        <w:t>./venv/Scripts/python.exe -m pip install -r requirements.txt   # Windows</w:t>
-        <w:br/>
-        <w:t>cp .env.example .env</w:t>
-        <w:br/>
-        <w:t>./venv/Scripts/python.exe -m assistant.ingest   # indexa a documentação</w:t>
-        <w:br/>
-        <w:t>./venv/Scripts/python.exe -m uvicorn main:app --port 8010</w:t>
+        <w:t>Autenticação e sessão</w:t>
       </w:r>
     </w:p>
     <w:p>
       <w:r>
-        <w:rPr>
-          <w:b w:val="0"/>
-          <w:i w:val="0"/>
-        </w:rPr>
-        <w:t>Detalhes completos, incluindo como obter uma chave secreta TOTP válida e o checklist de segurança pra uma versão de produção real, estão em:</w:t>
+        <w:t>Login (POST /api/auth/login) compara a senha informada com o hash bcrypt salvo em usuarios.senha_hash e, se bater, devolve um token assinado (JWT) mais os dados do usuário — nunca a senha. O frontend manda esse token em Authorization: Bearer &lt;token&gt; nas chamadas que precisam saber quem está logado.</w:t>
       </w:r>
     </w:p>
     <w:p>
@@ -1927,7 +1305,7 @@
         <w:pStyle w:val="ListBullet"/>
       </w:pPr>
       <w:r>
-        <w:t>backend/README.md — como rodar os dois serviços</w:t>
+        <w:t>GET /api/auth/me valida o token e devolve os dados do usuário — usado para restaurar a sessão ao recarregar a página</w:t>
       </w:r>
     </w:p>
     <w:p>
@@ -1935,7 +1313,31 @@
         <w:pStyle w:val="ListBullet"/>
       </w:pPr>
       <w:r>
-        <w:t>intranet-app/docs/meu-authenticator-arquitetura.md — arquitetura completa do Authenticator, incluindo por que não dá pra "espelhar" o Microsoft Authenticator já configurado</w:t>
+        <w:t>POST /api/auth/trocar-senha deixa o próprio usuário trocar a senha informando a atual; não existe fluxo de "esqueci minha senha" — reset fica a cargo de um administrador via db/set_senha.py</w:t>
+      </w:r>
+    </w:p>
+    <w:p>
+      <w:pPr>
+        <w:pStyle w:val="ListBullet"/>
+      </w:pPr>
+      <w:r>
+        <w:t>Endpoints que agem em nome de "quem está logado" (abrir uma solicitação, sugerir uma ideia, progresso do onboarding, anotação da Agenda, marcar aviso como lido) descobrem o usuário pelo token (require_user) — o frontend não informa mais quem ele é, só prova via token</w:t>
+      </w:r>
+    </w:p>
+    <w:p>
+      <w:pPr>
+        <w:pStyle w:val="ListBullet"/>
+      </w:pPr>
+      <w:r>
+        <w:t>require_admin bloqueia com 403 quem não tem perfil ADMINISTRADOR (hoje usado no resumo de onboarding; outros endpoints administrativos podem reaproveitar a mesma dependência)</w:t>
+      </w:r>
+    </w:p>
+    <w:p>
+      <w:pPr>
+        <w:pStyle w:val="ListBullet"/>
+      </w:pPr>
+      <w:r>
+        <w:t>Sem rate limiting no login e sem fluxo de recuperação de senha por e-mail — ambos ficam como próximo passo</w:t>
       </w:r>
     </w:p>
     <w:p>
@@ -1943,19 +1345,12 @@
         <w:pStyle w:val="Heading2"/>
       </w:pPr>
       <w:r>
-        <w:rPr>
-          <w:color w:val="192742"/>
-        </w:rPr>
-        <w:t>Banco de dados — rascunho de schema</w:t>
+        <w:t>Banco de dados</w:t>
       </w:r>
     </w:p>
     <w:p>
       <w:r>
-        <w:rPr>
-          <w:b w:val="0"/>
-          <w:i w:val="0"/>
-        </w:rPr>
-        <w:t>backend/db/schema.sql contém um schema PostgreSQL completo (pensado para rodar no Supabase, gerenciado via DBeaver), traduzindo cada mock do frontend em tabela real. É um rascunho pronto para uso, mas ainda não há nenhuma API ligada a ele — todo o app continua rodando 100% sobre os mocks em intranet-app/src/mocks/.</w:t>
+        <w:t>backend/db/schema.sql contém o schema PostgreSQL completo, aplicado no Supabase — não é mais rascunho, é o banco em uso pela aplicação.</w:t>
       </w:r>
     </w:p>
     <w:p>
@@ -1971,7 +1366,7 @@
         <w:pStyle w:val="ListBullet"/>
       </w:pPr>
       <w:r>
-        <w:t>Duas tabelas de junção: avisos_leituras (leitura de aviso por pessoa) e onboarding_progresso (progresso do checklist por funcionário).</w:t>
+        <w:t>Row Level Security (RLS) habilitado em todas as tabelas — fecha a API pública (PostgREST / anon key) do Supabase; o backend conecta como o papel postgres, que não é afetado por RLS.</w:t>
       </w:r>
     </w:p>
     <w:p>
@@ -1979,7 +1374,23 @@
         <w:pStyle w:val="ListBullet"/>
       </w:pPr>
       <w:r>
-        <w:t>authenticator_contas guarda o segredo TOTP como bytea criptografado — nunca texto plano.</w:t>
+        <w:t>Duas tabelas de junção já em uso: avisos_leituras (leitura de aviso por pessoa) e onboarding_progresso (progresso do checklist por funcionário).</w:t>
+      </w:r>
+    </w:p>
+    <w:p>
+      <w:pPr>
+        <w:pStyle w:val="ListBullet"/>
+      </w:pPr>
+      <w:r>
+        <w:t>authenticator_contas guarda o segredo TOTP como bytea criptografado, mas ainda não está em uso — o Meu Authenticator continua lendo do .env.</w:t>
+      </w:r>
+    </w:p>
+    <w:p>
+      <w:pPr>
+        <w:pStyle w:val="ListBullet"/>
+      </w:pPr>
+      <w:r>
+        <w:t>audiencias existe no schema mas não tem nenhuma API nem página própria ligada a ela (a funcionalidade foi removida da sidebar a pedido do escritório).</w:t>
       </w:r>
     </w:p>
     <w:p>
@@ -1992,10 +1403,6 @@
     </w:p>
     <w:p>
       <w:r>
-        <w:rPr>
-          <w:b w:val="0"/>
-          <w:i w:val="0"/>
-        </w:rPr>
         <w:t>Ver também docs/Levantamento_Conteudo_Necessario.docx — o inventário, tela por tela, de qual documentação e conteúdo real o escritório precisa fornecer para popular este banco (sem tratar de acessos/credenciais/infraestrutura, que ficam fora desse levantamento).</w:t>
       </w:r>
     </w:p>
@@ -2004,27 +1411,16 @@
         <w:pStyle w:val="Heading2"/>
       </w:pPr>
       <w:r>
-        <w:rPr>
-          <w:color w:val="192742"/>
-        </w:rPr>
         <w:t>Publicação / build</w:t>
       </w:r>
     </w:p>
     <w:p>
       <w:r>
-        <w:rPr>
-          <w:b w:val="0"/>
-          <w:i w:val="0"/>
-        </w:rPr>
-        <w:t>O repositório só guarda código-fonte — o build (intranet-app/dist/) nunca é commitado, é sempre gerado sob demanda com npm run build (ver "Como rodar localmente") e publicado copiando o conteúdo de dist/ para site/intranet/. Ainda não há hospedagem definida nem pipeline de deploy automatizado configurado; quando isso for decidido, o caminho mais direto pra um app estático como este é GitHub Pages com um workflow de GitHub Actions que builda e publica automaticamente a cada push, servindo site/ como raiz do domínio.</w:t>
+        <w:t>O repositório só guarda código-fonte — o build do frontend (intranet-app/dist/) nunca é commitado, é sempre gerado sob demanda com npm run build. O backend, por sua vez, precisa rodar continuamente num servidor (não é um site estático) — ainda não há hospedagem definida nem pipeline de deploy automatizado para nenhuma das duas partes. O caminho já decidido é: frontend publicado no domínio já existente (Hostinger) e backend rodando num VPS (também Hostinger) atrás de Nginx com HTTPS.</w:t>
       </w:r>
     </w:p>
     <w:p>
       <w:r>
-        <w:rPr>
-          <w:b w:val="0"/>
-          <w:i w:val="0"/>
-        </w:rPr>
         <w:t>O intranet-app/.gitignore já ignora node_modules/, dist/ e .env. O .gitignore da raiz do repo ignora venv/, __pycache__/, backend/chroma_data/, site/intranet/ (build local, não versionado), arquivos de lock temporários do Word/Excel/PowerPoint (~$*) e qualquer .env do backend também.</w:t>
       </w:r>
     </w:p>
@@ -2033,18 +1429,11 @@
         <w:pStyle w:val="Heading2"/>
       </w:pPr>
       <w:r>
-        <w:rPr>
-          <w:color w:val="192742"/>
-        </w:rPr>
         <w:t>O que é real e o que é mockado</w:t>
       </w:r>
     </w:p>
     <w:p>
       <w:r>
-        <w:rPr>
-          <w:b w:val="0"/>
-          <w:i w:val="0"/>
-        </w:rPr>
         <w:t>Isso é o ponto mais importante pra quem for continuar o projeto:</w:t>
       </w:r>
     </w:p>
@@ -2052,7 +1441,6 @@
       <w:tblPr>
         <w:tblStyle w:val="LightGrid-Accent1"/>
         <w:tblW w:type="auto" w:w="0"/>
-        <w:jc w:val="center"/>
         <w:tblLook w:firstColumn="1" w:firstRow="1" w:lastColumn="0" w:lastRow="0" w:noHBand="0" w:noVBand="1" w:val="04A0"/>
       </w:tblPr>
       <w:tblGrid>
@@ -2062,32 +1450,20 @@
       <w:tr>
         <w:tc>
           <w:tcPr>
-            <w:tcW w:type="dxa" w:w="3402"/>
-            <w:shd w:fill="192742"/>
+            <w:tcW w:type="dxa" w:w="4986"/>
           </w:tcPr>
           <w:p>
-            <w:r/>
             <w:r>
-              <w:rPr>
-                <w:b/>
-                <w:color w:val="FFFFFF"/>
-              </w:rPr>
               <w:t>Item</w:t>
             </w:r>
           </w:p>
         </w:tc>
         <w:tc>
           <w:tcPr>
-            <w:tcW w:type="dxa" w:w="6236"/>
-            <w:shd w:fill="192742"/>
+            <w:tcW w:type="dxa" w:w="4986"/>
           </w:tcPr>
           <w:p>
-            <w:r/>
             <w:r>
-              <w:rPr>
-                <w:b/>
-                <w:color w:val="FFFFFF"/>
-              </w:rPr>
               <w:t>Status</w:t>
             </w:r>
           </w:p>
@@ -2096,32 +1472,20 @@
       <w:tr>
         <w:tc>
           <w:tcPr>
-            <w:tcW w:type="dxa" w:w="3402"/>
+            <w:tcW w:type="dxa" w:w="4986"/>
           </w:tcPr>
           <w:p>
-            <w:pPr>
-              <w:spacing w:after="40"/>
-            </w:pPr>
             <w:r>
-              <w:rPr>
-                <w:sz w:val="19"/>
-              </w:rPr>
               <w:t>Layout, navegação, design</w:t>
             </w:r>
           </w:p>
         </w:tc>
         <w:tc>
           <w:tcPr>
-            <w:tcW w:type="dxa" w:w="6236"/>
+            <w:tcW w:type="dxa" w:w="4986"/>
           </w:tcPr>
           <w:p>
-            <w:pPr>
-              <w:spacing w:after="40"/>
-            </w:pPr>
             <w:r>
-              <w:rPr>
-                <w:sz w:val="19"/>
-              </w:rPr>
               <w:t>Real — pronto para produção</w:t>
             </w:r>
           </w:p>
@@ -2130,33 +1494,21 @@
       <w:tr>
         <w:tc>
           <w:tcPr>
-            <w:tcW w:type="dxa" w:w="3402"/>
+            <w:tcW w:type="dxa" w:w="4986"/>
           </w:tcPr>
           <w:p>
-            <w:pPr>
-              <w:spacing w:after="40"/>
-            </w:pPr>
             <w:r>
-              <w:rPr>
-                <w:sz w:val="19"/>
-              </w:rPr>
-              <w:t>Autenticação (login)</w:t>
+              <w:t>Autenticação (login, sessão, troca de senha)</w:t>
             </w:r>
           </w:p>
         </w:tc>
         <w:tc>
           <w:tcPr>
-            <w:tcW w:type="dxa" w:w="6236"/>
+            <w:tcW w:type="dxa" w:w="4986"/>
           </w:tcPr>
           <w:p>
-            <w:pPr>
-              <w:spacing w:after="40"/>
-            </w:pPr>
             <w:r>
-              <w:rPr>
-                <w:sz w:val="19"/>
-              </w:rPr>
-              <w:t>Mockada — checa um e-mail/senha fixos no frontend, sem sessão real</w:t>
+              <w:t>Real — hash de senha (bcrypt) + token de sessão (JWT); sem recuperação de senha por e-mail ainda</w:t>
             </w:r>
           </w:p>
         </w:tc>
@@ -2164,33 +1516,21 @@
       <w:tr>
         <w:tc>
           <w:tcPr>
-            <w:tcW w:type="dxa" w:w="3402"/>
+            <w:tcW w:type="dxa" w:w="4986"/>
           </w:tcPr>
           <w:p>
-            <w:pPr>
-              <w:spacing w:after="40"/>
-            </w:pPr>
             <w:r>
-              <w:rPr>
-                <w:sz w:val="19"/>
-              </w:rPr>
-              <w:t>Dados (funcionários, audiências, documentos etc.)</w:t>
+              <w:t>Banco de dados PostgreSQL</w:t>
             </w:r>
           </w:p>
         </w:tc>
         <w:tc>
           <w:tcPr>
-            <w:tcW w:type="dxa" w:w="6236"/>
+            <w:tcW w:type="dxa" w:w="4986"/>
           </w:tcPr>
           <w:p>
-            <w:pPr>
-              <w:spacing w:after="40"/>
-            </w:pPr>
             <w:r>
-              <w:rPr>
-                <w:sz w:val="19"/>
-              </w:rPr>
-              <w:t>Mockados — arrays fixos em src/mocks/, não persistem</w:t>
+              <w:t>Real — schema aplicado no Supabase (18 tabelas, Row Level Security habilitado)</w:t>
             </w:r>
           </w:p>
         </w:tc>
@@ -2198,32 +1538,196 @@
       <w:tr>
         <w:tc>
           <w:tcPr>
-            <w:tcW w:type="dxa" w:w="3402"/>
+            <w:tcW w:type="dxa" w:w="4986"/>
           </w:tcPr>
           <w:p>
-            <w:pPr>
-              <w:spacing w:after="40"/>
-            </w:pPr>
             <w:r>
-              <w:rPr>
-                <w:sz w:val="19"/>
-              </w:rPr>
+              <w:t>Funcionários, Férias, Feriados</w:t>
+            </w:r>
+          </w:p>
+        </w:tc>
+        <w:tc>
+          <w:tcPr>
+            <w:tcW w:type="dxa" w:w="4986"/>
+          </w:tcPr>
+          <w:p>
+            <w:r>
+              <w:t>Real — leitura via API</w:t>
+            </w:r>
+          </w:p>
+        </w:tc>
+      </w:tr>
+      <w:tr>
+        <w:tc>
+          <w:tcPr>
+            <w:tcW w:type="dxa" w:w="4986"/>
+          </w:tcPr>
+          <w:p>
+            <w:r>
+              <w:t>Agenda (compromissos)</w:t>
+            </w:r>
+          </w:p>
+        </w:tc>
+        <w:tc>
+          <w:tcPr>
+            <w:tcW w:type="dxa" w:w="4986"/>
+          </w:tcPr>
+          <w:p>
+            <w:r>
+              <w:t>Real — leitura via API</w:t>
+            </w:r>
+          </w:p>
+        </w:tc>
+      </w:tr>
+      <w:tr>
+        <w:tc>
+          <w:tcPr>
+            <w:tcW w:type="dxa" w:w="4986"/>
+          </w:tcPr>
+          <w:p>
+            <w:r>
+              <w:t>Agenda (anotações pessoais + alerta 10 min antes)</w:t>
+            </w:r>
+          </w:p>
+        </w:tc>
+        <w:tc>
+          <w:tcPr>
+            <w:tcW w:type="dxa" w:w="4986"/>
+          </w:tcPr>
+          <w:p>
+            <w:r>
+              <w:t>Real — anotações persistem por usuário no banco (antes eram localStorage); o alerta continua rodando só no navegador</w:t>
+            </w:r>
+          </w:p>
+        </w:tc>
+      </w:tr>
+      <w:tr>
+        <w:tc>
+          <w:tcPr>
+            <w:tcW w:type="dxa" w:w="4986"/>
+          </w:tcPr>
+          <w:p>
+            <w:r>
+              <w:t>Avisos</w:t>
+            </w:r>
+          </w:p>
+        </w:tc>
+        <w:tc>
+          <w:tcPr>
+            <w:tcW w:type="dxa" w:w="4986"/>
+          </w:tcPr>
+          <w:p>
+            <w:r>
+              <w:t>Real — leitura via API; "marcar como lido" persiste por usuário no banco</w:t>
+            </w:r>
+          </w:p>
+        </w:tc>
+      </w:tr>
+      <w:tr>
+        <w:tc>
+          <w:tcPr>
+            <w:tcW w:type="dxa" w:w="4986"/>
+          </w:tcPr>
+          <w:p>
+            <w:r>
+              <w:t>Solicitações</w:t>
+            </w:r>
+          </w:p>
+        </w:tc>
+        <w:tc>
+          <w:tcPr>
+            <w:tcW w:type="dxa" w:w="4986"/>
+          </w:tcPr>
+          <w:p>
+            <w:r>
+              <w:t>Real — persiste no banco; identidade de quem abre vem do token de sessão</w:t>
+            </w:r>
+          </w:p>
+        </w:tc>
+      </w:tr>
+      <w:tr>
+        <w:tc>
+          <w:tcPr>
+            <w:tcW w:type="dxa" w:w="4986"/>
+          </w:tcPr>
+          <w:p>
+            <w:r>
+              <w:t>Cooperativa de Ideias</w:t>
+            </w:r>
+          </w:p>
+        </w:tc>
+        <w:tc>
+          <w:tcPr>
+            <w:tcW w:type="dxa" w:w="4986"/>
+          </w:tcPr>
+          <w:p>
+            <w:r>
+              <w:t>Real — persiste no banco; identidade de quem sugere vem do token de sessão</w:t>
+            </w:r>
+          </w:p>
+        </w:tc>
+      </w:tr>
+      <w:tr>
+        <w:tc>
+          <w:tcPr>
+            <w:tcW w:type="dxa" w:w="4986"/>
+          </w:tcPr>
+          <w:p>
+            <w:r>
+              <w:t>Onboarding</w:t>
+            </w:r>
+          </w:p>
+        </w:tc>
+        <w:tc>
+          <w:tcPr>
+            <w:tcW w:type="dxa" w:w="4986"/>
+          </w:tcPr>
+          <w:p>
+            <w:r>
+              <w:t>Real — progresso por usuário no banco; resumo agregado exige perfil ADMINISTRADOR</w:t>
+            </w:r>
+          </w:p>
+        </w:tc>
+      </w:tr>
+      <w:tr>
+        <w:tc>
+          <w:tcPr>
+            <w:tcW w:type="dxa" w:w="4986"/>
+          </w:tcPr>
+          <w:p>
+            <w:r>
+              <w:t>Documentos, Tribunais, Base de Conhecimento, Manual Interno, Notificações</w:t>
+            </w:r>
+          </w:p>
+        </w:tc>
+        <w:tc>
+          <w:tcPr>
+            <w:tcW w:type="dxa" w:w="4986"/>
+          </w:tcPr>
+          <w:p>
+            <w:r>
+              <w:t>Real (leitura via API), mas o conteúdo ainda é o texto de exemplo original — não o conteúdo real do escritório</w:t>
+            </w:r>
+          </w:p>
+        </w:tc>
+      </w:tr>
+      <w:tr>
+        <w:tc>
+          <w:tcPr>
+            <w:tcW w:type="dxa" w:w="4986"/>
+          </w:tcPr>
+          <w:p>
+            <w:r>
               <w:t>Assistente IA — "Processos Gerais"</w:t>
             </w:r>
           </w:p>
         </w:tc>
         <w:tc>
           <w:tcPr>
-            <w:tcW w:type="dxa" w:w="6236"/>
+            <w:tcW w:type="dxa" w:w="4986"/>
           </w:tcPr>
           <w:p>
-            <w:pPr>
-              <w:spacing w:after="40"/>
-            </w:pPr>
             <w:r>
-              <w:rPr>
-                <w:sz w:val="19"/>
-              </w:rPr>
               <w:t>Parcialmente real — busca semântica (RAG) de verdade sobre a documentação interna via backend Python, sem LLM (devolve o trecho literal, não reescreve)</w:t>
             </w:r>
           </w:p>
@@ -2232,33 +1736,21 @@
       <w:tr>
         <w:tc>
           <w:tcPr>
-            <w:tcW w:type="dxa" w:w="3402"/>
+            <w:tcW w:type="dxa" w:w="4986"/>
           </w:tcPr>
           <w:p>
-            <w:pPr>
-              <w:spacing w:after="40"/>
-            </w:pPr>
             <w:r>
-              <w:rPr>
-                <w:sz w:val="19"/>
-              </w:rPr>
               <w:t>Assistente IA — "Comunicação"</w:t>
             </w:r>
           </w:p>
         </w:tc>
         <w:tc>
           <w:tcPr>
-            <w:tcW w:type="dxa" w:w="6236"/>
+            <w:tcW w:type="dxa" w:w="4986"/>
           </w:tcPr>
           <w:p>
-            <w:pPr>
-              <w:spacing w:after="40"/>
-            </w:pPr>
             <w:r>
-              <w:rPr>
-                <w:sz w:val="19"/>
-              </w:rPr>
-              <w:t>Mockado — respostas por palavra-chave, não é IA de verdade</w:t>
+              <w:t>Mockado por decisão — é geração assistida de texto, não consulta a documentos</w:t>
             </w:r>
           </w:p>
         </w:tc>
@@ -2266,33 +1758,21 @@
       <w:tr>
         <w:tc>
           <w:tcPr>
-            <w:tcW w:type="dxa" w:w="3402"/>
+            <w:tcW w:type="dxa" w:w="4986"/>
           </w:tcPr>
           <w:p>
-            <w:pPr>
-              <w:spacing w:after="40"/>
-            </w:pPr>
             <w:r>
-              <w:rPr>
-                <w:sz w:val="19"/>
-              </w:rPr>
               <w:t>Meu Authenticator</w:t>
             </w:r>
           </w:p>
         </w:tc>
         <w:tc>
           <w:tcPr>
-            <w:tcW w:type="dxa" w:w="6236"/>
+            <w:tcW w:type="dxa" w:w="4986"/>
           </w:tcPr>
           <w:p>
-            <w:pPr>
-              <w:spacing w:after="40"/>
-            </w:pPr>
             <w:r>
-              <w:rPr>
-                <w:sz w:val="19"/>
-              </w:rPr>
-              <w:t>Parcialmente real — o cálculo do código TOTP é real (RFC 6238), mas os segredos ficam num .env local, não num cofre de produção</w:t>
+              <w:t>Parcialmente real — o cálculo do código TOTP é real (RFC 6238), mas os segredos ficam num .env local; a tabela authenticator_contas existe mas não está em uso</w:t>
             </w:r>
           </w:p>
         </w:tc>
@@ -2300,33 +1780,21 @@
       <w:tr>
         <w:tc>
           <w:tcPr>
-            <w:tcW w:type="dxa" w:w="3402"/>
+            <w:tcW w:type="dxa" w:w="4986"/>
           </w:tcPr>
           <w:p>
-            <w:pPr>
-              <w:spacing w:after="40"/>
-            </w:pPr>
             <w:r>
-              <w:rPr>
-                <w:sz w:val="19"/>
-              </w:rPr>
-              <w:t>Agenda — alertas (toast + som)</w:t>
+              <w:t>Dashboard</w:t>
             </w:r>
           </w:p>
         </w:tc>
         <w:tc>
           <w:tcPr>
-            <w:tcW w:type="dxa" w:w="6236"/>
+            <w:tcW w:type="dxa" w:w="4986"/>
           </w:tcPr>
           <w:p>
-            <w:pPr>
-              <w:spacing w:after="40"/>
-            </w:pPr>
             <w:r>
-              <w:rPr>
-                <w:sz w:val="19"/>
-              </w:rPr>
-              <w:t>Real no frontend, mas só funciona com a aba aberta — sem backend, sem e-mail</w:t>
+              <w:t>Mockado — combina várias fontes de intranet-app/src/mocks/, não usa nenhuma API real ainda</w:t>
             </w:r>
           </w:p>
         </w:tc>
@@ -2334,33 +1802,21 @@
       <w:tr>
         <w:tc>
           <w:tcPr>
-            <w:tcW w:type="dxa" w:w="3402"/>
+            <w:tcW w:type="dxa" w:w="4986"/>
           </w:tcPr>
           <w:p>
-            <w:pPr>
-              <w:spacing w:after="40"/>
-            </w:pPr>
             <w:r>
-              <w:rPr>
-                <w:sz w:val="19"/>
-              </w:rPr>
-              <w:t>Central de Solicitações (criar nova)</w:t>
+              <w:t>Administração</w:t>
             </w:r>
           </w:p>
         </w:tc>
         <w:tc>
           <w:tcPr>
-            <w:tcW w:type="dxa" w:w="6236"/>
+            <w:tcW w:type="dxa" w:w="4986"/>
           </w:tcPr>
           <w:p>
-            <w:pPr>
-              <w:spacing w:after="40"/>
-            </w:pPr>
             <w:r>
-              <w:rPr>
-                <w:sz w:val="19"/>
-              </w:rPr>
-              <w:t>Funciona na sessão atual (soma no estado do React), mas não persiste ao recarregar a página</w:t>
+              <w:t>Mockado — combina várias fontes de intranet-app/src/mocks/</w:t>
             </w:r>
           </w:p>
         </w:tc>
@@ -2368,33 +1824,21 @@
       <w:tr>
         <w:tc>
           <w:tcPr>
-            <w:tcW w:type="dxa" w:w="3402"/>
+            <w:tcW w:type="dxa" w:w="4986"/>
           </w:tcPr>
           <w:p>
-            <w:pPr>
-              <w:spacing w:after="40"/>
-            </w:pPr>
             <w:r>
-              <w:rPr>
-                <w:sz w:val="19"/>
-              </w:rPr>
-              <w:t>Cooperativa de Ideias</w:t>
+              <w:t>Meu Perfil / Perfil do Funcionário</w:t>
             </w:r>
           </w:p>
         </w:tc>
         <w:tc>
           <w:tcPr>
-            <w:tcW w:type="dxa" w:w="6236"/>
+            <w:tcW w:type="dxa" w:w="4986"/>
           </w:tcPr>
           <w:p>
-            <w:pPr>
-              <w:spacing w:after="40"/>
-            </w:pPr>
             <w:r>
-              <w:rPr>
-                <w:sz w:val="19"/>
-              </w:rPr>
-              <w:t>Mockada — envio de ideia e troca de status funcionam na sessão, sem persistência</w:t>
+              <w:t>Parcialmente mockado — férias e audiências ainda vêm de mocks, não da API real de Férias</w:t>
             </w:r>
           </w:p>
         </w:tc>
@@ -2402,46 +1846,29 @@
       <w:tr>
         <w:tc>
           <w:tcPr>
-            <w:tcW w:type="dxa" w:w="3402"/>
+            <w:tcW w:type="dxa" w:w="4986"/>
           </w:tcPr>
           <w:p>
-            <w:pPr>
-              <w:spacing w:after="40"/>
-            </w:pPr>
             <w:r>
-              <w:rPr>
-                <w:sz w:val="19"/>
-              </w:rPr>
-              <w:t>Banco de dados PostgreSQL</w:t>
+              <w:t>Audiências (como página própria)</w:t>
             </w:r>
           </w:p>
         </w:tc>
         <w:tc>
           <w:tcPr>
-            <w:tcW w:type="dxa" w:w="6236"/>
+            <w:tcW w:type="dxa" w:w="4986"/>
           </w:tcPr>
           <w:p>
-            <w:pPr>
-              <w:spacing w:after="40"/>
-            </w:pPr>
             <w:r>
-              <w:rPr>
-                <w:sz w:val="19"/>
-              </w:rPr>
-              <w:t>Ainda não implementado — só existe o rascunho de schema em backend/db/schema.sql</w:t>
+              <w:t>Removida da sidebar a pedido do escritório; a tabela existe no banco, sem API nem página</w:t>
             </w:r>
           </w:p>
         </w:tc>
       </w:tr>
     </w:tbl>
-    <w:p/>
     <w:p>
       <w:r>
-        <w:rPr>
-          <w:b w:val="0"/>
-          <w:i w:val="0"/>
-        </w:rPr>
-        <w:t>Pra virar um sistema de produção de verdade, falta: implementar a API sobre o schema já rascunhado (backend/db/schema.sql), autenticação com hash de senha e sessão real (JWT ou cookie), e — se fizer sentido — plugar um LLM no Assistente IA por cima da busca RAG que já existe.</w:t>
+        <w:t>Pra virar um sistema de produção de verdade, falta principalmente: publicar o backend e o frontend (deploy), popular o conteúdo real do escritório, migrar Dashboard, Administração e Meu Perfil para as APIs reais já existentes, e — se fizer sentido — plugar um LLM no Assistente IA por cima da busca RAG que já existe.</w:t>
       </w:r>
     </w:p>
     <w:p>
@@ -2449,18 +1876,11 @@
         <w:pStyle w:val="Heading2"/>
       </w:pPr>
       <w:r>
-        <w:rPr>
-          <w:color w:val="192742"/>
-        </w:rPr>
         <w:t>Design system</w:t>
       </w:r>
     </w:p>
     <w:p>
       <w:r>
-        <w:rPr>
-          <w:b w:val="0"/>
-          <w:i w:val="0"/>
-        </w:rPr>
         <w:t>Definido em intranet-app/src/index.css (tokens Tailwind v4, bloco @theme):</w:t>
       </w:r>
     </w:p>
@@ -2506,19 +1926,11 @@
     </w:p>
     <w:p>
       <w:r>
-        <w:rPr>
-          <w:b w:val="0"/>
-          <w:i w:val="0"/>
-        </w:rPr>
         <w:t>Tipografia: Playfair Display (serifada, títulos/headline) + Inter (sans, corpo de texto) + monospace para labels tracked (ex.: "PORTAL RESTRITO" no login).</w:t>
       </w:r>
     </w:p>
     <w:p>
       <w:r>
-        <w:rPr>
-          <w:b w:val="0"/>
-          <w:i w:val="0"/>
-        </w:rPr>
         <w:t>Logo: src/assets/logo-gold.webp (wordmark completo, usado no login e no topo da sidebar quando expandida) e src/assets/logo-icon.png (só o monograma "EJ", usado quando a sidebar está recolhida).</w:t>
       </w:r>
     </w:p>
@@ -2527,18 +1939,11 @@
         <w:pStyle w:val="Heading2"/>
       </w:pPr>
       <w:r>
-        <w:rPr>
-          <w:color w:val="192742"/>
-        </w:rPr>
         <w:t>Segurança</w:t>
       </w:r>
     </w:p>
     <w:p>
       <w:r>
-        <w:rPr>
-          <w:b w:val="0"/>
-          <w:i w:val="0"/>
-        </w:rPr>
         <w:t>Pontos já implementados:</w:t>
       </w:r>
     </w:p>
@@ -2555,7 +1960,7 @@
         <w:pStyle w:val="ListBullet"/>
       </w:pPr>
       <w:r>
-        <w:t>Backend do Authenticator nunca expõe o segredo TOTP, só o código atual</w:t>
+        <w:t>Senha de usuário nunca em texto plano — hash bcrypt (usuarios.senha_hash)</w:t>
       </w:r>
     </w:p>
     <w:p>
@@ -2563,25 +1968,105 @@
         <w:pStyle w:val="ListBullet"/>
       </w:pPr>
       <w:r>
-        <w:t>Os dois endpoints do backend (Authenticator e Assistente IA) são protegidos pela mesma X-API-Key</w:t>
+        <w:t>Sessão de login via token assinado (JWT), com expiração configurável</w:t>
+      </w:r>
+    </w:p>
+    <w:p>
+      <w:pPr>
+        <w:pStyle w:val="ListBullet"/>
+      </w:pPr>
+      <w:r>
+        <w:t>Todos os endpoints exigem X-API-Key; os que agem em nome de um usuário também exigem o token de sessão, resolvendo a identidade no backend em vez de confiar no que o frontend informa</w:t>
+      </w:r>
+    </w:p>
+    <w:p>
+      <w:pPr>
+        <w:pStyle w:val="ListBullet"/>
+      </w:pPr>
+      <w:r>
+        <w:t>Endpoint de resumo administrativo (onboarding) exige perfil ADMINISTRADOR</w:t>
+      </w:r>
+    </w:p>
+    <w:p>
+      <w:pPr>
+        <w:pStyle w:val="ListBullet"/>
+      </w:pPr>
+      <w:r>
+        <w:t>Row Level Security habilitado em todas as tabelas do banco</w:t>
+      </w:r>
+    </w:p>
+    <w:p>
+      <w:pPr>
+        <w:pStyle w:val="ListBullet"/>
+      </w:pPr>
+      <w:r>
+        <w:t>Backend do Authenticator nunca expõe o segredo TOTP, só o código atual</w:t>
       </w:r>
     </w:p>
     <w:p>
       <w:r>
-        <w:rPr>
-          <w:b w:val="0"/>
-          <w:i w:val="0"/>
-        </w:rPr>
-        <w:t>Pontos pendentes antes de qualquer uso com dados reais de clientes ou credenciais reais de produção — ver checklist completo em intranet-app/docs/meu-authenticator-arquitetura.md, seção "Segurança".</w:t>
+        <w:t>Pontos pendentes antes de qualquer uso com dados reais de clientes ou credenciais reais de produção:</w:t>
+      </w:r>
+    </w:p>
+    <w:p>
+      <w:pPr>
+        <w:pStyle w:val="ListBullet"/>
+      </w:pPr>
+      <w:r>
+        <w:t>A X-API-Key ainda fica embutida no bundle público do frontend (compilada no JS pelo Vite) — hoje é uma segunda camada atrás da sessão, mas não é segredo de verdade num app publicado</w:t>
+      </w:r>
+    </w:p>
+    <w:p>
+      <w:pPr>
+        <w:pStyle w:val="ListBullet"/>
+      </w:pPr>
+      <w:r>
+        <w:t>Sem rate limiting / bloqueio por tentativas de login incorretas</w:t>
+      </w:r>
+    </w:p>
+    <w:p>
+      <w:pPr>
+        <w:pStyle w:val="ListBullet"/>
+      </w:pPr>
+      <w:r>
+        <w:t>Sem fluxo de recuperação de senha (reset é manual, via administrador)</w:t>
+      </w:r>
+    </w:p>
+    <w:p>
+      <w:pPr>
+        <w:pStyle w:val="ListBullet"/>
+      </w:pPr>
+      <w:r>
+        <w:t>RBAC ainda limitado (só administrador x resto); sem controle de acesso por setor/perfil sobre a documentação indexada do Assistente IA</w:t>
+      </w:r>
+    </w:p>
+    <w:p>
+      <w:pPr>
+        <w:pStyle w:val="ListBullet"/>
+      </w:pPr>
+      <w:r>
+        <w:t>Sem logs de auditoria</w:t>
+      </w:r>
+    </w:p>
+    <w:p>
+      <w:pPr>
+        <w:pStyle w:val="ListBullet"/>
+      </w:pPr>
+      <w:r>
+        <w:t>Segredos TOTP do Meu Authenticator continuam em .env, não em authenticator_contas com criptografia real</w:t>
+      </w:r>
+    </w:p>
+    <w:p>
+      <w:pPr>
+        <w:pStyle w:val="ListBullet"/>
+      </w:pPr>
+      <w:r>
+        <w:t>.env de produção deve migrar para um cofre de segredos de verdade (Azure Key Vault, HashiCorp Vault etc.) quando o deploy acontecer</w:t>
       </w:r>
     </w:p>
     <w:p>
       <w:r>
-        <w:rPr>
-          <w:b w:val="0"/>
-          <w:i w:val="0"/>
-        </w:rPr>
-        <w:t>Resumo: falta hash de senha, autenticação de sessão real, RBAC no backend (incluindo controle de acesso por setor/perfil sobre a documentação indexada do Assistente IA), logs de auditoria, criptografia real dos segredos TOTP se migrarem para o banco (ver authenticator_contas em backend/db/schema.sql), e mover os .env de produção para um cofre de segredos de verdade (Azure Key Vault, HashiCorp Vault, etc.).</w:t>
+        <w:t>Checklist completo específico do Meu Authenticator em intranet-app/docs/meu-authenticator-arquitetura.md, seção "Segurança".</w:t>
       </w:r>
     </w:p>
     <w:p>
@@ -2589,9 +2074,6 @@
         <w:pStyle w:val="Heading2"/>
       </w:pPr>
       <w:r>
-        <w:rPr>
-          <w:color w:val="192742"/>
-        </w:rPr>
         <w:t>Próximos passos sugeridos</w:t>
       </w:r>
     </w:p>
@@ -2600,7 +2082,7 @@
         <w:pStyle w:val="ListNumber"/>
       </w:pPr>
       <w:r>
-        <w:t>Implementar a API REST sobre o schema já rascunhado (backend/db/schema.sql), substituindo os mocks do frontend um módulo de cada vez</w:t>
+        <w:t>Deploy: backend num VPS (Hostinger) atrás de Nginx + HTTPS, frontend publicado no domínio já existente</w:t>
       </w:r>
     </w:p>
     <w:p>
@@ -2608,7 +2090,7 @@
         <w:pStyle w:val="ListNumber"/>
       </w:pPr>
       <w:r>
-        <w:t>Autenticação real (hash de senha + sessão/JWT), permitindo login de outros funcionários além do Eraldo</w:t>
+        <w:t>Popular a Base de Conhecimento, o Manual Interno e os Documentos com o conteúdo real do escritório (ver docs/Levantamento_Conteudo_Necessario.docx)</w:t>
       </w:r>
     </w:p>
     <w:p>
@@ -2616,7 +2098,15 @@
         <w:pStyle w:val="ListNumber"/>
       </w:pPr>
       <w:r>
-        <w:t>Popular a Base de Conhecimento e o Manual Interno com o conteúdo real do escritório (ver docs/Levantamento_Conteudo_Necessario.docx)</w:t>
+        <w:t>Migrar Dashboard, Administração e Meu Perfil das últimas fontes mockadas para as APIs reais já existentes</w:t>
+      </w:r>
+    </w:p>
+    <w:p>
+      <w:pPr>
+        <w:pStyle w:val="ListNumber"/>
+      </w:pPr>
+      <w:r>
+        <w:t>Fluxo de recuperação de senha e rate limiting no login</w:t>
       </w:r>
     </w:p>
     <w:p>
@@ -2635,17 +2125,9 @@
         <w:t>Plugar um LLM (Claude, OpenAI ou Ollama local) no Assistente IA para reescrever a resposta de forma mais natural, mantendo a base RAG atual</w:t>
       </w:r>
     </w:p>
-    <w:p>
-      <w:pPr>
-        <w:pStyle w:val="ListNumber"/>
-      </w:pPr>
-      <w:r>
-        <w:t>Deploy automatizado (hoje o processo de build → copiar para site/intranet/ → commit é manual)</w:t>
-      </w:r>
-    </w:p>
     <w:sectPr>
       <w:pgSz w:w="12240" w:h="15840"/>
-      <w:pgMar w:top="1020" w:right="1134" w:bottom="1020" w:left="1134" w:header="720" w:footer="720" w:gutter="0"/>
+      <w:pgMar w:top="1440" w:right="1134" w:bottom="1440" w:left="1134" w:header="720" w:footer="720" w:gutter="0"/>
       <w:cols w:space="720"/>
       <w:docGrid w:linePitch="360"/>
     </w:sectPr>
@@ -3016,10 +2498,6 @@
     <w:name w:val="Normal"/>
     <w:qFormat/>
     <w:rsid w:val="00FC693F"/>
-    <w:rPr>
-      <w:rFonts w:ascii="Calibri" w:hAnsi="Calibri"/>
-      <w:sz w:val="21"/>
-    </w:rPr>
   </w:style>
   <w:style w:type="paragraph" w:styleId="Header">
     <w:name w:val="header"/>

</xml_diff>